<commit_message>
docs(urd): tambah Latar Belakang + Temuan Kendala V1 di Bab 1
Latar belakang menyebut peluncuran V1 18 Maret 2025 + alasan v2.
Temuan kendala V1 (4 item) di-petakan ke FR/NFR yang relevan di V2.
Renumber sub-section 1.3..1.5 → 1.5..1.7.

Co-Authored-By: Claude Opus 4.7 (1M context) <noreply@anthropic.com>
</commit_message>
<xml_diff>
--- a/docs/urd/simlab-v2-urd.docx
+++ b/docs/urd/simlab-v2-urd.docx
@@ -150,7 +150,7 @@
         </w:p>
       </w:sdtContent>
     </w:sdt>
-    <w:bookmarkStart w:id="25" w:name="pendahuluan"/>
+    <w:bookmarkStart w:id="32" w:name="pendahuluan"/>
     <w:p>
       <w:pPr>
         <w:pStyle w:val="Heading1"/>
@@ -168,7 +168,7 @@
         <w:t xml:space="preserve">1. Pendahuluan</w:t>
       </w:r>
     </w:p>
-    <w:bookmarkStart w:id="20" w:name="tujuan"/>
+    <w:bookmarkStart w:id="20" w:name="latar-belakang"/>
     <w:p>
       <w:pPr>
         <w:pStyle w:val="Heading2"/>
@@ -183,7 +183,7 @@
         <w:tab/>
       </w:r>
       <w:r>
-        <w:t xml:space="preserve">1.1 Tujuan</w:t>
+        <w:t xml:space="preserve">1.1 Latar Belakang</w:t>
       </w:r>
     </w:p>
     <w:p>
@@ -191,63 +191,54 @@
         <w:pStyle w:val="FirstParagraph"/>
       </w:pPr>
       <w:r>
-        <w:t xml:space="preserve">Dokumen ini adalah</w:t>
-      </w:r>
-      <w:r>
-        <w:t xml:space="preserve"> </w:t>
+        <w:t xml:space="preserve">Sejak diluncurkan pada tanggal</w:t>
+      </w:r>
+      <w:r>
+        <w:t xml:space="preserve"> </w:t>
+      </w:r>
+      <w:r>
+        <w:rPr>
+          <w:bCs/>
+          <w:b/>
+        </w:rPr>
+        <w:t xml:space="preserve">18 Maret 2025</w:t>
+      </w:r>
+      <w:r>
+        <w:t xml:space="preserve">, Sistem Informasi Manajemen Laboratorium (SIMLAB) Statistika versi 1 telah digunakan secara aktif oleh mahasiswa, dosen, dan tenaga kependidikan FMIPA UII. Dalam masa operasinya, ditemukan sejumlah kendala yang tersebar ke berbagai tingkatan pengguna serta diterima berbagai umpan balik (</w:t>
       </w:r>
       <w:r>
         <w:rPr>
           <w:iCs/>
           <w:i/>
         </w:rPr>
-        <w:t xml:space="preserve">User Requirement Document</w:t>
-      </w:r>
-      <w:r>
-        <w:t xml:space="preserve"> </w:t>
-      </w:r>
-      <w:r>
-        <w:t xml:space="preserve">(URD) untuk sistem</w:t>
-      </w:r>
-      <w:r>
-        <w:t xml:space="preserve"> </w:t>
-      </w:r>
-      <w:r>
-        <w:rPr>
-          <w:bCs/>
-          <w:b/>
-        </w:rPr>
-        <w:t xml:space="preserve">SIMLAB V2</w:t>
-      </w:r>
-      <w:r>
-        <w:t xml:space="preserve"> </w:t>
-      </w:r>
-      <w:r>
-        <w:t xml:space="preserve">versi 2.0.1. Tujuannya:</w:t>
-      </w:r>
-    </w:p>
-    <w:p>
-      <w:pPr>
-        <w:numPr>
-          <w:ilvl w:val="0"/>
-          <w:numId w:val="1001"/>
-        </w:numPr>
-        <w:pStyle w:val="Compact"/>
-      </w:pPr>
-      <w:r>
-        <w:t xml:space="preserve">Mendefinisikan kebutuhan fungsional dan non-fungsional sistem secara formal.</w:t>
-      </w:r>
-    </w:p>
-    <w:p>
-      <w:pPr>
-        <w:numPr>
-          <w:ilvl w:val="0"/>
-          <w:numId w:val="1001"/>
-        </w:numPr>
-        <w:pStyle w:val="Compact"/>
-      </w:pPr>
-      <w:r>
-        <w:t xml:space="preserve">Menjadi acuan baku saat</w:t>
+        <w:t xml:space="preserve">feedback</w:t>
+      </w:r>
+      <w:r>
+        <w:t xml:space="preserve">) dari mahasiswa, dosen, dan tenaga kependidikan.</w:t>
+      </w:r>
+    </w:p>
+    <w:p>
+      <w:pPr>
+        <w:pStyle w:val="BodyText"/>
+      </w:pPr>
+      <w:r>
+        <w:t xml:space="preserve">Dokumen ini disusun sebagai</w:t>
+      </w:r>
+      <w:r>
+        <w:t xml:space="preserve"> </w:t>
+      </w:r>
+      <w:r>
+        <w:rPr>
+          <w:bCs/>
+          <w:b/>
+        </w:rPr>
+        <w:t xml:space="preserve">dasar perencanaan perbaikan dan peningkatan fitur</w:t>
+      </w:r>
+      <w:r>
+        <w:t xml:space="preserve"> </w:t>
+      </w:r>
+      <w:r>
+        <w:t xml:space="preserve">pada SIMLAB Statistika menuju versi 2 (v2.0.1). URD ini memformalkan kebutuhan pengguna yang akan diakomodasi pada versi baru, sekaligus menjadi acuan bersama antara pengelola laboratorium dan tim pengembang dalam proses</w:t>
       </w:r>
       <w:r>
         <w:t xml:space="preserve"> </w:t>
@@ -260,219 +251,899 @@
         <w:t xml:space="preserve">handover</w:t>
       </w:r>
       <w:r>
-        <w:t xml:space="preserve"> </w:t>
-      </w:r>
-      <w:r>
-        <w:t xml:space="preserve">sistem kepada pengelola Laboratorium Statistika FMIPA UII dan pemangku kepentingan terkait.</w:t>
-      </w:r>
-    </w:p>
-    <w:p>
-      <w:pPr>
-        <w:numPr>
-          <w:ilvl w:val="0"/>
-          <w:numId w:val="1001"/>
-        </w:numPr>
-        <w:pStyle w:val="Compact"/>
-      </w:pPr>
-      <w:r>
-        <w:t xml:space="preserve">Menjadi dasar verifikasi penerimaan (</w:t>
+        <w:t xml:space="preserve">.</w:t>
+      </w:r>
+    </w:p>
+    <w:bookmarkEnd w:id="20"/>
+    <w:bookmarkStart w:id="26" w:name="temuan-kendala-pada-versi-1"/>
+    <w:p>
+      <w:pPr>
+        <w:pStyle w:val="Heading2"/>
+      </w:pPr>
+      <w:r>
+        <w:rPr>
+          <w:rStyle w:val="SectionNumber"/>
+        </w:rPr>
+        <w:t xml:space="preserve">1.2</w:t>
+      </w:r>
+      <w:r>
+        <w:tab/>
+      </w:r>
+      <w:r>
+        <w:t xml:space="preserve">1.2 Temuan Kendala pada Versi 1</w:t>
+      </w:r>
+    </w:p>
+    <w:p>
+      <w:pPr>
+        <w:pStyle w:val="FirstParagraph"/>
+      </w:pPr>
+      <w:r>
+        <w:t xml:space="preserve">Subbagian ini merangkum kendala signifikan yang ditemukan pada SIMLAB V1 setelah dioperasionalkan. Kendala-kendala berikut menjadi salah satu pendorong utama penyusunan persyaratan pada versi 2.</w:t>
+      </w:r>
+    </w:p>
+    <w:bookmarkStart w:id="21" w:name="X98eb19b2fc3a44d7b12e8f6b3616cefbe87fac9"/>
+    <w:p>
+      <w:pPr>
+        <w:pStyle w:val="Heading3"/>
+      </w:pPr>
+      <w:r>
+        <w:rPr>
+          <w:rStyle w:val="SectionNumber"/>
+        </w:rPr>
+        <w:t xml:space="preserve">1.2.1</w:t>
+      </w:r>
+      <w:r>
+        <w:tab/>
+      </w:r>
+      <w:r>
+        <w:t xml:space="preserve">1.2.1 Nama Dosen Tidak Muncul di Form Peminjaman Laptop</w:t>
+      </w:r>
+    </w:p>
+    <w:p>
+      <w:pPr>
+        <w:pStyle w:val="FirstParagraph"/>
+      </w:pPr>
+      <w:r>
+        <w:t xml:space="preserve">Kendala ini terjadi pada tingkatan pengguna</w:t>
+      </w:r>
+      <w:r>
+        <w:t xml:space="preserve"> </w:t>
+      </w:r>
+      <w:r>
+        <w:rPr>
+          <w:bCs/>
+          <w:b/>
+        </w:rPr>
+        <w:t xml:space="preserve">Mahasiswa</w:t>
+      </w:r>
+      <w:r>
+        <w:t xml:space="preserve">. Mahasiswa yang hendak meminjam laptop tidak dapat memilih nama dosen pembimbing karena data dosen tidak muncul pada</w:t>
+      </w:r>
+      <w:r>
+        <w:t xml:space="preserve"> </w:t>
       </w:r>
       <w:r>
         <w:rPr>
           <w:iCs/>
           <w:i/>
         </w:rPr>
-        <w:t xml:space="preserve">acceptance</w:t>
-      </w:r>
-      <w:r>
-        <w:t xml:space="preserve">) bahwa sistem yang dibangun memenuhi kebutuhan pengguna.</w:t>
-      </w:r>
-    </w:p>
-    <w:p>
-      <w:pPr>
-        <w:numPr>
-          <w:ilvl w:val="0"/>
-          <w:numId w:val="1001"/>
-        </w:numPr>
-        <w:pStyle w:val="Compact"/>
-      </w:pPr>
-      <w:r>
-        <w:t xml:space="preserve">Menjadi rujukan bila kelak dilakukan perubahan, audit, atau pengembangan lanjutan.</w:t>
-      </w:r>
-    </w:p>
-    <w:p>
-      <w:pPr>
-        <w:pStyle w:val="FirstParagraph"/>
-      </w:pPr>
-      <w:r>
-        <w:t xml:space="preserve">Dokumen ini disusun mengikuti pendekatan</w:t>
-      </w:r>
-      <w:r>
-        <w:t xml:space="preserve"> </w:t>
-      </w:r>
-      <w:r>
-        <w:rPr>
-          <w:bCs/>
-          <w:b/>
-        </w:rPr>
-        <w:t xml:space="preserve">IEEE Std 29148-2018</w:t>
-      </w:r>
-      <w:r>
-        <w:t xml:space="preserve"> </w:t>
-      </w:r>
-      <w:r>
-        <w:t xml:space="preserve">(sebelumnya IEEE 830) untuk spesifikasi kebutuhan perangkat lunak.</w:t>
-      </w:r>
-    </w:p>
-    <w:bookmarkEnd w:id="20"/>
-    <w:bookmarkStart w:id="21" w:name="ruang-lingkup"/>
-    <w:p>
-      <w:pPr>
-        <w:pStyle w:val="Heading2"/>
-      </w:pPr>
-      <w:r>
-        <w:rPr>
-          <w:rStyle w:val="SectionNumber"/>
-        </w:rPr>
-        <w:t xml:space="preserve">1.2</w:t>
-      </w:r>
-      <w:r>
-        <w:tab/>
-      </w:r>
-      <w:r>
-        <w:t xml:space="preserve">1.2 Ruang Lingkup</w:t>
-      </w:r>
-    </w:p>
-    <w:p>
-      <w:pPr>
-        <w:pStyle w:val="FirstParagraph"/>
-      </w:pPr>
-      <w:r>
-        <w:rPr>
-          <w:bCs/>
-          <w:b/>
-        </w:rPr>
-        <w:t xml:space="preserve">Nama Produk:</w:t>
-      </w:r>
-      <w:r>
-        <w:t xml:space="preserve"> </w:t>
-      </w:r>
-      <w:r>
-        <w:t xml:space="preserve">Sistem Informasi Manajemen Laboratorium (SIMLAB) Statistika versi 2.0.1.</w:t>
-      </w:r>
-    </w:p>
-    <w:p>
-      <w:pPr>
-        <w:pStyle w:val="BodyText"/>
-      </w:pPr>
-      <w:r>
-        <w:rPr>
-          <w:bCs/>
-          <w:b/>
-        </w:rPr>
-        <w:t xml:space="preserve">Cakupan Fungsional:</w:t>
-      </w:r>
-    </w:p>
-    <w:p>
-      <w:pPr>
-        <w:numPr>
-          <w:ilvl w:val="0"/>
-          <w:numId w:val="1002"/>
-        </w:numPr>
-        <w:pStyle w:val="Compact"/>
-      </w:pPr>
-      <w:r>
-        <w:t xml:space="preserve">Manajemen identitas pengguna terintegrasi dengan SSO UII (Shibboleth).</w:t>
-      </w:r>
-    </w:p>
-    <w:p>
-      <w:pPr>
-        <w:numPr>
-          <w:ilvl w:val="0"/>
-          <w:numId w:val="1002"/>
-        </w:numPr>
-        <w:pStyle w:val="Compact"/>
-      </w:pPr>
-      <w:r>
-        <w:t xml:space="preserve">Pengaturan otorisasi berbasis peran (RBAC) bagi enam jenis pengguna.</w:t>
-      </w:r>
-    </w:p>
-    <w:p>
-      <w:pPr>
-        <w:numPr>
-          <w:ilvl w:val="0"/>
-          <w:numId w:val="1002"/>
-        </w:numPr>
-        <w:pStyle w:val="Compact"/>
-      </w:pPr>
-      <w:r>
-        <w:t xml:space="preserve">Pengelolaan inventaris laboratorium: aset laptop, alat non-laptop, ruangan, dan barang habis pakai.</w:t>
-      </w:r>
-    </w:p>
-    <w:p>
-      <w:pPr>
-        <w:numPr>
-          <w:ilvl w:val="0"/>
-          <w:numId w:val="1002"/>
-        </w:numPr>
-        <w:pStyle w:val="Compact"/>
-      </w:pPr>
-      <w:r>
-        <w:t xml:space="preserve">Pengajuan, persetujuan, dan pencatatan peminjaman laptop (Tugas Akhir &amp; Praktikum).</w:t>
-      </w:r>
-    </w:p>
-    <w:p>
-      <w:pPr>
-        <w:numPr>
-          <w:ilvl w:val="0"/>
-          <w:numId w:val="1002"/>
-        </w:numPr>
-        <w:pStyle w:val="Compact"/>
-      </w:pPr>
-      <w:r>
-        <w:t xml:space="preserve">Pengajuan, persetujuan, dan pencatatan peminjaman alat non-laptop.</w:t>
-      </w:r>
-    </w:p>
-    <w:p>
-      <w:pPr>
-        <w:numPr>
-          <w:ilvl w:val="0"/>
-          <w:numId w:val="1002"/>
-        </w:numPr>
-        <w:pStyle w:val="Compact"/>
-      </w:pPr>
-      <w:r>
-        <w:t xml:space="preserve">Pengajuan dan persetujuan reservasi ruangan oleh mahasiswa, dosen, dan tendik.</w:t>
-      </w:r>
-    </w:p>
-    <w:p>
-      <w:pPr>
-        <w:numPr>
-          <w:ilvl w:val="0"/>
-          <w:numId w:val="1002"/>
-        </w:numPr>
-        <w:pStyle w:val="Compact"/>
-      </w:pPr>
-      <w:r>
-        <w:t xml:space="preserve">Pengajuan, penandatanganan digital, dan penerbitan Surat Bebas Lab untuk pendaftaran yudisium.</w:t>
-      </w:r>
-    </w:p>
-    <w:p>
-      <w:pPr>
-        <w:numPr>
-          <w:ilvl w:val="0"/>
-          <w:numId w:val="1002"/>
-        </w:numPr>
-        <w:pStyle w:val="Compact"/>
-      </w:pPr>
-      <w:r>
-        <w:t xml:space="preserve">Notifikasi otomatis multi-saluran (</w:t>
+        <w:t xml:space="preserve">dropdown</w:t>
+      </w:r>
+      <w:r>
+        <w:t xml:space="preserve">. Pemeriksaan pada basis data menunjukkan data dosen tetap ada, dan pada</w:t>
+      </w:r>
+      <w:r>
+        <w:t xml:space="preserve"> </w:t>
       </w:r>
       <w:r>
         <w:rPr>
           <w:iCs/>
           <w:i/>
         </w:rPr>
+        <w:t xml:space="preserve">dashboard</w:t>
+      </w:r>
+      <w:r>
+        <w:t xml:space="preserve"> </w:t>
+      </w:r>
+      <w:r>
+        <w:t xml:space="preserve">Super Admin peran dosen telah sesuai. Dengan demikian, akar masalah berada pada lapisan tampilan/penyajian, bukan pada data.</w:t>
+      </w:r>
+    </w:p>
+    <w:p>
+      <w:pPr>
+        <w:pStyle w:val="BodyText"/>
+      </w:pPr>
+      <w:r>
+        <w:rPr>
+          <w:iCs/>
+          <w:i/>
+        </w:rPr>
+        <w:t xml:space="preserve">[Gambar 1 — Data dosen pada basis data (disisipkan)]</w:t>
+      </w:r>
+    </w:p>
+    <w:p>
+      <w:pPr>
+        <w:pStyle w:val="BodyText"/>
+      </w:pPr>
+      <w:r>
+        <w:rPr>
+          <w:iCs/>
+          <w:i/>
+        </w:rPr>
+        <w:t xml:space="preserve">[Gambar 2 — Peran dosen pada Super Admin (disisipkan)]</w:t>
+      </w:r>
+    </w:p>
+    <w:p>
+      <w:pPr>
+        <w:pStyle w:val="BodyText"/>
+      </w:pPr>
+      <w:r>
+        <w:rPr>
+          <w:iCs/>
+          <w:i/>
+        </w:rPr>
+        <w:t xml:space="preserve">[Gambar 3 — Tampilan dosen tidak ditemukan pada pengguna mahasiswa (disisipkan)]</w:t>
+      </w:r>
+    </w:p>
+    <w:bookmarkEnd w:id="21"/>
+    <w:bookmarkStart w:id="22" w:name="X2e73a9fd6aec9fa3e616896463736bfa0b502ea"/>
+    <w:p>
+      <w:pPr>
+        <w:pStyle w:val="Heading3"/>
+      </w:pPr>
+      <w:r>
+        <w:rPr>
+          <w:rStyle w:val="SectionNumber"/>
+        </w:rPr>
+        <w:t xml:space="preserve">1.2.2</w:t>
+      </w:r>
+      <w:r>
+        <w:tab/>
+      </w:r>
+      <w:r>
+        <w:t xml:space="preserve">1.2.2 Data Peminjaman Muncul Selain ID yang Diinput</w:t>
+      </w:r>
+    </w:p>
+    <w:p>
+      <w:pPr>
+        <w:pStyle w:val="FirstParagraph"/>
+      </w:pPr>
+      <w:r>
+        <w:t xml:space="preserve">Kendala ini terjadi pada tingkatan pengguna</w:t>
+      </w:r>
+      <w:r>
+        <w:t xml:space="preserve"> </w:t>
+      </w:r>
+      <w:r>
+        <w:rPr>
+          <w:bCs/>
+          <w:b/>
+        </w:rPr>
+        <w:t xml:space="preserve">Laboran</w:t>
+      </w:r>
+      <w:r>
+        <w:t xml:space="preserve">. Ketika laboran memeriksa detail peminjaman seorang mahasiswa dengan memasukkan ID pada kolom pencarian, sistem justru menampilkan</w:t>
+      </w:r>
+      <w:r>
+        <w:t xml:space="preserve"> </w:t>
+      </w:r>
+      <w:r>
+        <w:rPr>
+          <w:bCs/>
+          <w:b/>
+        </w:rPr>
+        <w:t xml:space="preserve">seluruh peminjaman aktif</w:t>
+      </w:r>
+      <w:r>
+        <w:t xml:space="preserve">, bukan hanya yang sesuai ID. Akibatnya, laboran harus kembali ke tab Aset dan menelusuri detail peminjaman satu per satu — alur yang tidak efisien dan rawan kesalahan.</w:t>
+      </w:r>
+    </w:p>
+    <w:p>
+      <w:pPr>
+        <w:pStyle w:val="BodyText"/>
+      </w:pPr>
+      <w:r>
+        <w:rPr>
+          <w:iCs/>
+          <w:i/>
+        </w:rPr>
+        <w:t xml:space="preserve">[Gambar 4 — Tampilan detail peminjaman dengan input ID pengguna (disisipkan)]</w:t>
+      </w:r>
+    </w:p>
+    <w:bookmarkEnd w:id="22"/>
+    <w:bookmarkStart w:id="23" w:name="X52cd305e371e7caffe61d7570f3e4dd8c5d17e3"/>
+    <w:p>
+      <w:pPr>
+        <w:pStyle w:val="Heading3"/>
+      </w:pPr>
+      <w:r>
+        <w:rPr>
+          <w:rStyle w:val="SectionNumber"/>
+        </w:rPr>
+        <w:t xml:space="preserve">1.2.3</w:t>
+      </w:r>
+      <w:r>
+        <w:tab/>
+      </w:r>
+      <w:r>
+        <w:t xml:space="preserve">1.2.3 Mahasiswa Sudah Bebas Pinjaman tetapi Tidak Bisa Mengajukan Surat Bebas Lab</w:t>
+      </w:r>
+    </w:p>
+    <w:p>
+      <w:pPr>
+        <w:pStyle w:val="FirstParagraph"/>
+      </w:pPr>
+      <w:r>
+        <w:t xml:space="preserve">Kendala ini terjadi pada tingkatan pengguna</w:t>
+      </w:r>
+      <w:r>
+        <w:t xml:space="preserve"> </w:t>
+      </w:r>
+      <w:r>
+        <w:rPr>
+          <w:bCs/>
+          <w:b/>
+        </w:rPr>
+        <w:t xml:space="preserve">Mahasiswa</w:t>
+      </w:r>
+      <w:r>
+        <w:t xml:space="preserve">. Mahasiswa yang pernah meminjam laptop dan telah mengembalikannya tidak dapat mengajukan permohonan Surat Bebas Lab. Pemeriksaan pada basis data menunjukkan mahasiswa bersangkutan</w:t>
+      </w:r>
+      <w:r>
+        <w:t xml:space="preserve"> </w:t>
+      </w:r>
+      <w:r>
+        <w:rPr>
+          <w:bCs/>
+          <w:b/>
+        </w:rPr>
+        <w:t xml:space="preserve">tidak lagi memiliki tanggungan</w:t>
+      </w:r>
+      <w:r>
+        <w:t xml:space="preserve">, namun tombol</w:t>
+      </w:r>
+      <w:r>
+        <w:t xml:space="preserve"> </w:t>
+      </w:r>
+      <w:r>
+        <w:t xml:space="preserve">“</w:t>
+      </w:r>
+      <w:r>
+        <w:t xml:space="preserve">Pengajuan Surat Bebas Lab</w:t>
+      </w:r>
+      <w:r>
+        <w:t xml:space="preserve">”</w:t>
+      </w:r>
+      <w:r>
+        <w:t xml:space="preserve"> </w:t>
+      </w:r>
+      <w:r>
+        <w:t xml:space="preserve">tetap berstatus</w:t>
+      </w:r>
+      <w:r>
+        <w:t xml:space="preserve"> </w:t>
+      </w:r>
+      <w:r>
+        <w:rPr>
+          <w:iCs/>
+          <w:i/>
+        </w:rPr>
+        <w:t xml:space="preserve">disabled</w:t>
+      </w:r>
+      <w:r>
+        <w:t xml:space="preserve">. Hal ini mengindikasikan logika</w:t>
+      </w:r>
+      <w:r>
+        <w:t xml:space="preserve"> </w:t>
+      </w:r>
+      <w:r>
+        <w:rPr>
+          <w:iCs/>
+          <w:i/>
+        </w:rPr>
+        <w:t xml:space="preserve">gating</w:t>
+      </w:r>
+      <w:r>
+        <w:t xml:space="preserve"> </w:t>
+      </w:r>
+      <w:r>
+        <w:t xml:space="preserve">pada sisi tampilan tidak konsisten dengan kondisi data sebenarnya.</w:t>
+      </w:r>
+    </w:p>
+    <w:p>
+      <w:pPr>
+        <w:pStyle w:val="BodyText"/>
+      </w:pPr>
+      <w:r>
+        <w:rPr>
+          <w:iCs/>
+          <w:i/>
+        </w:rPr>
+        <w:t xml:space="preserve">[Gambar 5 — Basis data: mahasiswa tidak memiliki pinjaman aktif (disisipkan)]</w:t>
+      </w:r>
+    </w:p>
+    <w:p>
+      <w:pPr>
+        <w:pStyle w:val="BodyText"/>
+      </w:pPr>
+      <w:r>
+        <w:rPr>
+          <w:iCs/>
+          <w:i/>
+        </w:rPr>
+        <w:t xml:space="preserve">[Gambar 6 — Tombol Pengajuan Surat Bebas Lab masih ter-disable (disisipkan)]</w:t>
+      </w:r>
+    </w:p>
+    <w:bookmarkEnd w:id="23"/>
+    <w:bookmarkStart w:id="24" w:name="nama-dosen-tercampur-dengan-mahasiswa"/>
+    <w:p>
+      <w:pPr>
+        <w:pStyle w:val="Heading3"/>
+      </w:pPr>
+      <w:r>
+        <w:rPr>
+          <w:rStyle w:val="SectionNumber"/>
+        </w:rPr>
+        <w:t xml:space="preserve">1.2.4</w:t>
+      </w:r>
+      <w:r>
+        <w:tab/>
+      </w:r>
+      <w:r>
+        <w:t xml:space="preserve">1.2.4 Nama Dosen Tercampur dengan Mahasiswa</w:t>
+      </w:r>
+    </w:p>
+    <w:p>
+      <w:pPr>
+        <w:pStyle w:val="FirstParagraph"/>
+      </w:pPr>
+      <w:r>
+        <w:t xml:space="preserve">Pada fitur pengajuan peminjaman laptop, ketika mahasiswa memilih nama dosen pada</w:t>
+      </w:r>
+      <w:r>
+        <w:t xml:space="preserve"> </w:t>
+      </w:r>
+      <w:r>
+        <w:rPr>
+          <w:iCs/>
+          <w:i/>
+        </w:rPr>
+        <w:t xml:space="preserve">dropdown</w:t>
+      </w:r>
+      <w:r>
+        <w:t xml:space="preserve">, sistem menampilkan</w:t>
+      </w:r>
+      <w:r>
+        <w:t xml:space="preserve"> </w:t>
+      </w:r>
+      <w:r>
+        <w:rPr>
+          <w:bCs/>
+          <w:b/>
+        </w:rPr>
+        <w:t xml:space="preserve">seluruh pengguna yang terdaftar</w:t>
+      </w:r>
+      <w:r>
+        <w:t xml:space="preserve"> </w:t>
+      </w:r>
+      <w:r>
+        <w:t xml:space="preserve">di SIMLAB tanpa filter peran. Akibatnya, mahasiswa berisiko salah memilih nama bukan-dosen sebagai pembimbing dan UX menjadi membingungkan.</w:t>
+      </w:r>
+    </w:p>
+    <w:p>
+      <w:pPr>
+        <w:pStyle w:val="BodyText"/>
+      </w:pPr>
+      <w:r>
+        <w:rPr>
+          <w:iCs/>
+          <w:i/>
+        </w:rPr>
+        <w:t xml:space="preserve">[Gambar 7 — Nama dosen bercampur dengan seluruh pengguna terdaftar (disisipkan)]</w:t>
+      </w:r>
+    </w:p>
+    <w:bookmarkEnd w:id="24"/>
+    <w:bookmarkStart w:id="25" w:name="implikasi-terhadap-persyaratan-versi-2"/>
+    <w:p>
+      <w:pPr>
+        <w:pStyle w:val="Heading3"/>
+      </w:pPr>
+      <w:r>
+        <w:rPr>
+          <w:rStyle w:val="SectionNumber"/>
+        </w:rPr>
+        <w:t xml:space="preserve">1.2.5</w:t>
+      </w:r>
+      <w:r>
+        <w:tab/>
+      </w:r>
+      <w:r>
+        <w:t xml:space="preserve">1.2.5 Implikasi terhadap Persyaratan Versi 2</w:t>
+      </w:r>
+    </w:p>
+    <w:p>
+      <w:pPr>
+        <w:pStyle w:val="FirstParagraph"/>
+      </w:pPr>
+      <w:r>
+        <w:t xml:space="preserve">Keempat temuan di atas dipetakan menjadi persyaratan eksplisit pada SIMLAB V2:</w:t>
+      </w:r>
+    </w:p>
+    <w:tbl>
+      <w:tblPr>
+        <w:tblStyle w:val="Table"/>
+        <w:tblW w:type="pct" w:w="5000"/>
+        <w:tblLook w:firstRow="1" w:lastRow="0" w:firstColumn="0" w:lastColumn="0" w:noHBand="0" w:noVBand="0" w:val="0020"/>
+        <w:jc w:val="start"/>
+      </w:tblPr>
+      <w:tblGrid>
+        <w:gridCol w:w="3113"/>
+        <w:gridCol w:w="4806"/>
+      </w:tblGrid>
+      <w:tr>
+        <w:trPr>
+          <w:tblHeader w:val="true"/>
+        </w:trPr>
+        <w:tc>
+          <w:tcPr/>
+          <w:p>
+            <w:pPr>
+              <w:pStyle w:val="Compact"/>
+              <w:jc w:val="left"/>
+            </w:pPr>
+            <w:r>
+              <w:t xml:space="preserve">Temuan V1</w:t>
+            </w:r>
+          </w:p>
+        </w:tc>
+        <w:tc>
+          <w:tcPr/>
+          <w:p>
+            <w:pPr>
+              <w:pStyle w:val="Compact"/>
+              <w:jc w:val="left"/>
+            </w:pPr>
+            <w:r>
+              <w:t xml:space="preserve">Persyaratan V2 yang Mengakomodasi</w:t>
+            </w:r>
+          </w:p>
+        </w:tc>
+      </w:tr>
+      <w:tr>
+        <w:tc>
+          <w:tcPr/>
+          <w:p>
+            <w:pPr>
+              <w:pStyle w:val="Compact"/>
+              <w:jc w:val="left"/>
+            </w:pPr>
+            <w:r>
+              <w:t xml:space="preserve">1.2.1 Nama dosen tidak muncul</w:t>
+            </w:r>
+          </w:p>
+        </w:tc>
+        <w:tc>
+          <w:tcPr/>
+          <w:p>
+            <w:pPr>
+              <w:pStyle w:val="Compact"/>
+              <w:jc w:val="left"/>
+            </w:pPr>
+            <w:r>
+              <w:t xml:space="preserve">FR-LOAN-001 + FR-USER-001 (filter peran DOSEN pada</w:t>
+            </w:r>
+            <w:r>
+              <w:t xml:space="preserve"> </w:t>
+            </w:r>
+            <w:r>
+              <w:rPr>
+                <w:iCs/>
+                <w:i/>
+              </w:rPr>
+              <w:t xml:space="preserve">dropdown</w:t>
+            </w:r>
+            <w:r>
+              <w:t xml:space="preserve">)</w:t>
+            </w:r>
+          </w:p>
+        </w:tc>
+      </w:tr>
+      <w:tr>
+        <w:tc>
+          <w:tcPr/>
+          <w:p>
+            <w:pPr>
+              <w:pStyle w:val="Compact"/>
+              <w:jc w:val="left"/>
+            </w:pPr>
+            <w:r>
+              <w:t xml:space="preserve">1.2.2 Pencarian peminjaman tidak ter-filter</w:t>
+            </w:r>
+          </w:p>
+        </w:tc>
+        <w:tc>
+          <w:tcPr/>
+          <w:p>
+            <w:pPr>
+              <w:pStyle w:val="Compact"/>
+              <w:jc w:val="left"/>
+            </w:pPr>
+            <w:r>
+              <w:t xml:space="preserve">FR-LOAN-010 + FR-HIST-001 (riwayat ter-filter per pengguna)</w:t>
+            </w:r>
+          </w:p>
+        </w:tc>
+      </w:tr>
+      <w:tr>
+        <w:tc>
+          <w:tcPr/>
+          <w:p>
+            <w:pPr>
+              <w:pStyle w:val="Compact"/>
+              <w:jc w:val="left"/>
+            </w:pPr>
+            <w:r>
+              <w:t xml:space="preserve">1.2.3 Tombol Surat Bebas Lab salah</w:t>
+            </w:r>
+            <w:r>
+              <w:t xml:space="preserve"> </w:t>
+            </w:r>
+            <w:r>
+              <w:rPr>
+                <w:iCs/>
+                <w:i/>
+              </w:rPr>
+              <w:t xml:space="preserve">gating</w:t>
+            </w:r>
+          </w:p>
+        </w:tc>
+        <w:tc>
+          <w:tcPr/>
+          <w:p>
+            <w:pPr>
+              <w:pStyle w:val="Compact"/>
+              <w:jc w:val="left"/>
+            </w:pPr>
+            <w:r>
+              <w:t xml:space="preserve">FR-CLEAR-001 + NFR-USE-001 (otorisasi &amp; UX konsisten dengan data)</w:t>
+            </w:r>
+          </w:p>
+        </w:tc>
+      </w:tr>
+      <w:tr>
+        <w:tc>
+          <w:tcPr/>
+          <w:p>
+            <w:pPr>
+              <w:pStyle w:val="Compact"/>
+              <w:jc w:val="left"/>
+            </w:pPr>
+            <w:r>
+              <w:t xml:space="preserve">1.2.4 Dosen bercampur dengan semua pengguna</w:t>
+            </w:r>
+          </w:p>
+        </w:tc>
+        <w:tc>
+          <w:tcPr/>
+          <w:p>
+            <w:pPr>
+              <w:pStyle w:val="Compact"/>
+              <w:jc w:val="left"/>
+            </w:pPr>
+            <w:r>
+              <w:t xml:space="preserve">FR-USER-001 (daftar pengguna dengan filter peran)</w:t>
+            </w:r>
+          </w:p>
+        </w:tc>
+      </w:tr>
+    </w:tbl>
+    <w:bookmarkEnd w:id="25"/>
+    <w:bookmarkEnd w:id="26"/>
+    <w:bookmarkStart w:id="27" w:name="tujuan"/>
+    <w:p>
+      <w:pPr>
+        <w:pStyle w:val="Heading2"/>
+      </w:pPr>
+      <w:r>
+        <w:rPr>
+          <w:rStyle w:val="SectionNumber"/>
+        </w:rPr>
+        <w:t xml:space="preserve">1.3</w:t>
+      </w:r>
+      <w:r>
+        <w:tab/>
+      </w:r>
+      <w:r>
+        <w:t xml:space="preserve">1.3 Tujuan</w:t>
+      </w:r>
+    </w:p>
+    <w:p>
+      <w:pPr>
+        <w:pStyle w:val="FirstParagraph"/>
+      </w:pPr>
+      <w:r>
+        <w:t xml:space="preserve">Dokumen ini adalah</w:t>
+      </w:r>
+      <w:r>
+        <w:t xml:space="preserve"> </w:t>
+      </w:r>
+      <w:r>
+        <w:rPr>
+          <w:iCs/>
+          <w:i/>
+        </w:rPr>
+        <w:t xml:space="preserve">User Requirement Document</w:t>
+      </w:r>
+      <w:r>
+        <w:t xml:space="preserve"> </w:t>
+      </w:r>
+      <w:r>
+        <w:t xml:space="preserve">(URD) untuk sistem</w:t>
+      </w:r>
+      <w:r>
+        <w:t xml:space="preserve"> </w:t>
+      </w:r>
+      <w:r>
+        <w:rPr>
+          <w:bCs/>
+          <w:b/>
+        </w:rPr>
+        <w:t xml:space="preserve">SIMLAB V2</w:t>
+      </w:r>
+      <w:r>
+        <w:t xml:space="preserve"> </w:t>
+      </w:r>
+      <w:r>
+        <w:t xml:space="preserve">versi 2.0.1. Tujuannya:</w:t>
+      </w:r>
+    </w:p>
+    <w:p>
+      <w:pPr>
+        <w:numPr>
+          <w:ilvl w:val="0"/>
+          <w:numId w:val="1001"/>
+        </w:numPr>
+        <w:pStyle w:val="Compact"/>
+      </w:pPr>
+      <w:r>
+        <w:t xml:space="preserve">Mendefinisikan kebutuhan fungsional dan non-fungsional sistem secara formal.</w:t>
+      </w:r>
+    </w:p>
+    <w:p>
+      <w:pPr>
+        <w:numPr>
+          <w:ilvl w:val="0"/>
+          <w:numId w:val="1001"/>
+        </w:numPr>
+        <w:pStyle w:val="Compact"/>
+      </w:pPr>
+      <w:r>
+        <w:t xml:space="preserve">Menjadi acuan baku saat</w:t>
+      </w:r>
+      <w:r>
+        <w:t xml:space="preserve"> </w:t>
+      </w:r>
+      <w:r>
+        <w:rPr>
+          <w:iCs/>
+          <w:i/>
+        </w:rPr>
+        <w:t xml:space="preserve">handover</w:t>
+      </w:r>
+      <w:r>
+        <w:t xml:space="preserve"> </w:t>
+      </w:r>
+      <w:r>
+        <w:t xml:space="preserve">sistem kepada pengelola Laboratorium Statistika FMIPA UII dan pemangku kepentingan terkait.</w:t>
+      </w:r>
+    </w:p>
+    <w:p>
+      <w:pPr>
+        <w:numPr>
+          <w:ilvl w:val="0"/>
+          <w:numId w:val="1001"/>
+        </w:numPr>
+        <w:pStyle w:val="Compact"/>
+      </w:pPr>
+      <w:r>
+        <w:t xml:space="preserve">Menjadi dasar verifikasi penerimaan (</w:t>
+      </w:r>
+      <w:r>
+        <w:rPr>
+          <w:iCs/>
+          <w:i/>
+        </w:rPr>
+        <w:t xml:space="preserve">acceptance</w:t>
+      </w:r>
+      <w:r>
+        <w:t xml:space="preserve">) bahwa sistem yang dibangun memenuhi kebutuhan pengguna.</w:t>
+      </w:r>
+    </w:p>
+    <w:p>
+      <w:pPr>
+        <w:numPr>
+          <w:ilvl w:val="0"/>
+          <w:numId w:val="1001"/>
+        </w:numPr>
+        <w:pStyle w:val="Compact"/>
+      </w:pPr>
+      <w:r>
+        <w:t xml:space="preserve">Menjadi rujukan bila kelak dilakukan perubahan, audit, atau pengembangan lanjutan.</w:t>
+      </w:r>
+    </w:p>
+    <w:p>
+      <w:pPr>
+        <w:pStyle w:val="FirstParagraph"/>
+      </w:pPr>
+      <w:r>
+        <w:t xml:space="preserve">Dokumen ini disusun mengikuti pendekatan</w:t>
+      </w:r>
+      <w:r>
+        <w:t xml:space="preserve"> </w:t>
+      </w:r>
+      <w:r>
+        <w:rPr>
+          <w:bCs/>
+          <w:b/>
+        </w:rPr>
+        <w:t xml:space="preserve">IEEE Std 29148-2018</w:t>
+      </w:r>
+      <w:r>
+        <w:t xml:space="preserve"> </w:t>
+      </w:r>
+      <w:r>
+        <w:t xml:space="preserve">(sebelumnya IEEE 830) untuk spesifikasi kebutuhan perangkat lunak.</w:t>
+      </w:r>
+    </w:p>
+    <w:bookmarkEnd w:id="27"/>
+    <w:bookmarkStart w:id="28" w:name="ruang-lingkup"/>
+    <w:p>
+      <w:pPr>
+        <w:pStyle w:val="Heading2"/>
+      </w:pPr>
+      <w:r>
+        <w:rPr>
+          <w:rStyle w:val="SectionNumber"/>
+        </w:rPr>
+        <w:t xml:space="preserve">1.4</w:t>
+      </w:r>
+      <w:r>
+        <w:tab/>
+      </w:r>
+      <w:r>
+        <w:t xml:space="preserve">1.4 Ruang Lingkup</w:t>
+      </w:r>
+    </w:p>
+    <w:p>
+      <w:pPr>
+        <w:pStyle w:val="FirstParagraph"/>
+      </w:pPr>
+      <w:r>
+        <w:rPr>
+          <w:bCs/>
+          <w:b/>
+        </w:rPr>
+        <w:t xml:space="preserve">Nama Produk:</w:t>
+      </w:r>
+      <w:r>
+        <w:t xml:space="preserve"> </w:t>
+      </w:r>
+      <w:r>
+        <w:t xml:space="preserve">Sistem Informasi Manajemen Laboratorium (SIMLAB) Statistika versi 2.0.1.</w:t>
+      </w:r>
+    </w:p>
+    <w:p>
+      <w:pPr>
+        <w:pStyle w:val="BodyText"/>
+      </w:pPr>
+      <w:r>
+        <w:rPr>
+          <w:bCs/>
+          <w:b/>
+        </w:rPr>
+        <w:t xml:space="preserve">Cakupan Fungsional:</w:t>
+      </w:r>
+    </w:p>
+    <w:p>
+      <w:pPr>
+        <w:numPr>
+          <w:ilvl w:val="0"/>
+          <w:numId w:val="1002"/>
+        </w:numPr>
+        <w:pStyle w:val="Compact"/>
+      </w:pPr>
+      <w:r>
+        <w:t xml:space="preserve">Manajemen identitas pengguna terintegrasi dengan SSO UII (Shibboleth).</w:t>
+      </w:r>
+    </w:p>
+    <w:p>
+      <w:pPr>
+        <w:numPr>
+          <w:ilvl w:val="0"/>
+          <w:numId w:val="1002"/>
+        </w:numPr>
+        <w:pStyle w:val="Compact"/>
+      </w:pPr>
+      <w:r>
+        <w:t xml:space="preserve">Pengaturan otorisasi berbasis peran (RBAC) bagi enam jenis pengguna.</w:t>
+      </w:r>
+    </w:p>
+    <w:p>
+      <w:pPr>
+        <w:numPr>
+          <w:ilvl w:val="0"/>
+          <w:numId w:val="1002"/>
+        </w:numPr>
+        <w:pStyle w:val="Compact"/>
+      </w:pPr>
+      <w:r>
+        <w:t xml:space="preserve">Pengelolaan inventaris laboratorium: aset laptop, alat non-laptop, ruangan, dan barang habis pakai.</w:t>
+      </w:r>
+    </w:p>
+    <w:p>
+      <w:pPr>
+        <w:numPr>
+          <w:ilvl w:val="0"/>
+          <w:numId w:val="1002"/>
+        </w:numPr>
+        <w:pStyle w:val="Compact"/>
+      </w:pPr>
+      <w:r>
+        <w:t xml:space="preserve">Pengajuan, persetujuan, dan pencatatan peminjaman laptop (Tugas Akhir &amp; Praktikum).</w:t>
+      </w:r>
+    </w:p>
+    <w:p>
+      <w:pPr>
+        <w:numPr>
+          <w:ilvl w:val="0"/>
+          <w:numId w:val="1002"/>
+        </w:numPr>
+        <w:pStyle w:val="Compact"/>
+      </w:pPr>
+      <w:r>
+        <w:t xml:space="preserve">Pengajuan, persetujuan, dan pencatatan peminjaman alat non-laptop.</w:t>
+      </w:r>
+    </w:p>
+    <w:p>
+      <w:pPr>
+        <w:numPr>
+          <w:ilvl w:val="0"/>
+          <w:numId w:val="1002"/>
+        </w:numPr>
+        <w:pStyle w:val="Compact"/>
+      </w:pPr>
+      <w:r>
+        <w:t xml:space="preserve">Pengajuan dan persetujuan reservasi ruangan oleh mahasiswa, dosen, dan tendik.</w:t>
+      </w:r>
+    </w:p>
+    <w:p>
+      <w:pPr>
+        <w:numPr>
+          <w:ilvl w:val="0"/>
+          <w:numId w:val="1002"/>
+        </w:numPr>
+        <w:pStyle w:val="Compact"/>
+      </w:pPr>
+      <w:r>
+        <w:t xml:space="preserve">Pengajuan, penandatanganan digital, dan penerbitan Surat Bebas Lab untuk pendaftaran yudisium.</w:t>
+      </w:r>
+    </w:p>
+    <w:p>
+      <w:pPr>
+        <w:numPr>
+          <w:ilvl w:val="0"/>
+          <w:numId w:val="1002"/>
+        </w:numPr>
+        <w:pStyle w:val="Compact"/>
+      </w:pPr>
+      <w:r>
+        <w:t xml:space="preserve">Notifikasi otomatis multi-saluran (</w:t>
+      </w:r>
+      <w:r>
+        <w:rPr>
+          <w:iCs/>
+          <w:i/>
+        </w:rPr>
         <w:t xml:space="preserve">email</w:t>
       </w:r>
       <w:r>
@@ -578,8 +1249,8 @@
         <w:t xml:space="preserve">Integrasi dengan sistem akademik kampus (SIMAK).</w:t>
       </w:r>
     </w:p>
-    <w:bookmarkEnd w:id="21"/>
-    <w:bookmarkStart w:id="22" w:name="definisi-akronim"/>
+    <w:bookmarkEnd w:id="28"/>
+    <w:bookmarkStart w:id="29" w:name="definisi-akronim"/>
     <w:p>
       <w:pPr>
         <w:pStyle w:val="Heading2"/>
@@ -588,13 +1259,13 @@
         <w:rPr>
           <w:rStyle w:val="SectionNumber"/>
         </w:rPr>
-        <w:t xml:space="preserve">1.3</w:t>
+        <w:t xml:space="preserve">1.5</w:t>
       </w:r>
       <w:r>
         <w:tab/>
       </w:r>
       <w:r>
-        <w:t xml:space="preserve">1.3 Definisi &amp; Akronim</w:t>
+        <w:t xml:space="preserve">1.5 Definisi &amp; Akronim</w:t>
       </w:r>
     </w:p>
     <w:tbl>
@@ -1152,8 +1823,8 @@
         </w:tc>
       </w:tr>
     </w:tbl>
-    <w:bookmarkEnd w:id="22"/>
-    <w:bookmarkStart w:id="23" w:name="referensi"/>
+    <w:bookmarkEnd w:id="29"/>
+    <w:bookmarkStart w:id="30" w:name="referensi"/>
     <w:p>
       <w:pPr>
         <w:pStyle w:val="Heading2"/>
@@ -1162,13 +1833,13 @@
         <w:rPr>
           <w:rStyle w:val="SectionNumber"/>
         </w:rPr>
-        <w:t xml:space="preserve">1.4</w:t>
+        <w:t xml:space="preserve">1.6</w:t>
       </w:r>
       <w:r>
         <w:tab/>
       </w:r>
       <w:r>
-        <w:t xml:space="preserve">1.4 Referensi</w:t>
+        <w:t xml:space="preserve">1.6 Referensi</w:t>
       </w:r>
     </w:p>
     <w:p>
@@ -1235,8 +1906,8 @@
         <w:t xml:space="preserve">Pedoman Penyelenggaraan Akademik FMIPA UII (terkait alur yudisium dan kelengkapan administratif).</w:t>
       </w:r>
     </w:p>
-    <w:bookmarkEnd w:id="23"/>
-    <w:bookmarkStart w:id="24" w:name="struktur-dokumen"/>
+    <w:bookmarkEnd w:id="30"/>
+    <w:bookmarkStart w:id="31" w:name="struktur-dokumen"/>
     <w:p>
       <w:pPr>
         <w:pStyle w:val="Heading2"/>
@@ -1245,13 +1916,13 @@
         <w:rPr>
           <w:rStyle w:val="SectionNumber"/>
         </w:rPr>
-        <w:t xml:space="preserve">1.5</w:t>
+        <w:t xml:space="preserve">1.7</w:t>
       </w:r>
       <w:r>
         <w:tab/>
       </w:r>
       <w:r>
-        <w:t xml:space="preserve">1.5 Struktur Dokumen</w:t>
+        <w:t xml:space="preserve">1.7 Struktur Dokumen</w:t>
       </w:r>
     </w:p>
     <w:p>
@@ -1259,7 +1930,7 @@
         <w:pStyle w:val="FirstParagraph"/>
       </w:pPr>
       <w:r>
-        <w:t xml:space="preserve">Bab 2 menjelaskan deskripsi umum sistem, peran pengguna, dan asumsi/konsuensi yang berlaku. Bab 3 berisi persyaratan fungsional (FR) per modul. Bab 4 berisi persyaratan non-fungsional (NFR). Bab 5 menyajikan</w:t>
+        <w:t xml:space="preserve">Bab 1 (sedang dibaca) memuat latar belakang, temuan kendala V1, tujuan, ruang lingkup, akronim, dan referensi. Bab 2 menjelaskan deskripsi umum sistem, peran pengguna, dan asumsi/konsekuensi yang berlaku. Bab 3 berisi persyaratan fungsional (FR) per modul. Bab 4 berisi persyaratan non-fungsional (NFR). Bab 5 menyajikan</w:t>
       </w:r>
       <w:r>
         <w:t xml:space="preserve"> </w:t>
@@ -1294,9 +1965,9 @@
         <w:t xml:space="preserve">dan asumsi. Bab 7 berisi kriteria penerimaan dan halaman pengesahan.</w:t>
       </w:r>
     </w:p>
-    <w:bookmarkEnd w:id="24"/>
-    <w:bookmarkEnd w:id="25"/>
-    <w:bookmarkStart w:id="37" w:name="deskripsi-umum"/>
+    <w:bookmarkEnd w:id="31"/>
+    <w:bookmarkEnd w:id="32"/>
+    <w:bookmarkStart w:id="44" w:name="deskripsi-umum"/>
     <w:p>
       <w:pPr>
         <w:pStyle w:val="Heading1"/>
@@ -1314,7 +1985,7 @@
         <w:t xml:space="preserve">2. Deskripsi Umum</w:t>
       </w:r>
     </w:p>
-    <w:bookmarkStart w:id="26" w:name="perspektif-produk"/>
+    <w:bookmarkStart w:id="33" w:name="perspektif-produk"/>
     <w:p>
       <w:pPr>
         <w:pStyle w:val="Heading2"/>
@@ -1446,8 +2117,8 @@
         <w:t xml:space="preserve">SIMLAB versi 1.x yang sebelumnya berbasis stack legacy.</w:t>
       </w:r>
     </w:p>
-    <w:bookmarkEnd w:id="26"/>
-    <w:bookmarkStart w:id="27" w:name="fungsi-produk-tingkat-tinggi"/>
+    <w:bookmarkEnd w:id="33"/>
+    <w:bookmarkStart w:id="34" w:name="fungsi-produk-tingkat-tinggi"/>
     <w:p>
       <w:pPr>
         <w:pStyle w:val="Heading2"/>
@@ -1873,8 +2544,8 @@
         </w:tc>
       </w:tr>
     </w:tbl>
-    <w:bookmarkEnd w:id="27"/>
-    <w:bookmarkStart w:id="34" w:name="karakteristik-pengguna"/>
+    <w:bookmarkEnd w:id="34"/>
+    <w:bookmarkStart w:id="41" w:name="karakteristik-pengguna"/>
     <w:p>
       <w:pPr>
         <w:pStyle w:val="Heading2"/>
@@ -1892,7 +2563,7 @@
         <w:t xml:space="preserve">2.3 Karakteristik Pengguna</w:t>
       </w:r>
     </w:p>
-    <w:bookmarkStart w:id="28" w:name="mahasiswa-mahasiswa"/>
+    <w:bookmarkStart w:id="35" w:name="mahasiswa-mahasiswa"/>
     <w:p>
       <w:pPr>
         <w:pStyle w:val="Heading3"/>
@@ -2008,8 +2679,8 @@
         <w:t xml:space="preserve">Mengakses sistem dari perangkat pribadi (laptop atau ponsel).</w:t>
       </w:r>
     </w:p>
-    <w:bookmarkEnd w:id="28"/>
-    <w:bookmarkStart w:id="29" w:name="dosen-dosen"/>
+    <w:bookmarkEnd w:id="35"/>
+    <w:bookmarkStart w:id="36" w:name="dosen-dosen"/>
     <w:p>
       <w:pPr>
         <w:pStyle w:val="Heading3"/>
@@ -2116,8 +2787,8 @@
         <w:t xml:space="preserve">(tidak harian).</w:t>
       </w:r>
     </w:p>
-    <w:bookmarkEnd w:id="29"/>
-    <w:bookmarkStart w:id="30" w:name="laboran-laboran"/>
+    <w:bookmarkEnd w:id="36"/>
+    <w:bookmarkStart w:id="37" w:name="laboran-laboran"/>
     <w:p>
       <w:pPr>
         <w:pStyle w:val="Heading3"/>
@@ -2193,8 +2864,8 @@
         <w:t xml:space="preserve">Bertanggung jawab atas serah-terima fisik aset, pencatatan denda, dan persetujuan tahap awal (laboran).</w:t>
       </w:r>
     </w:p>
-    <w:bookmarkEnd w:id="30"/>
-    <w:bookmarkStart w:id="31" w:name="kepala-lab-kepala_lab"/>
+    <w:bookmarkEnd w:id="37"/>
+    <w:bookmarkStart w:id="38" w:name="kepala-lab-kepala_lab"/>
     <w:p>
       <w:pPr>
         <w:pStyle w:val="Heading3"/>
@@ -2273,8 +2944,8 @@
         <w:t xml:space="preserve">Memiliki akses audit dan inventaris penuh atas lab yang dipimpin.</w:t>
       </w:r>
     </w:p>
-    <w:bookmarkEnd w:id="31"/>
-    <w:bookmarkStart w:id="32" w:name="tendik-staff-staff"/>
+    <w:bookmarkEnd w:id="38"/>
+    <w:bookmarkStart w:id="39" w:name="tendik-staff-staff"/>
     <w:p>
       <w:pPr>
         <w:pStyle w:val="Heading3"/>
@@ -2341,8 +3012,8 @@
         <w:t xml:space="preserve">kegiatan ketendikan.</w:t>
       </w:r>
     </w:p>
-    <w:bookmarkEnd w:id="32"/>
-    <w:bookmarkStart w:id="33" w:name="super-admin-super_admin"/>
+    <w:bookmarkEnd w:id="39"/>
+    <w:bookmarkStart w:id="40" w:name="super-admin-super_admin"/>
     <w:p>
       <w:pPr>
         <w:pStyle w:val="Heading3"/>
@@ -2405,9 +3076,9 @@
         <w:t xml:space="preserve">Bertanggung jawab atas konfigurasi global, pemeliharaan modul Petunjuk, dan audit lintas-lab.</w:t>
       </w:r>
     </w:p>
-    <w:bookmarkEnd w:id="33"/>
-    <w:bookmarkEnd w:id="34"/>
-    <w:bookmarkStart w:id="35" w:name="lingkungan-operasi"/>
+    <w:bookmarkEnd w:id="40"/>
+    <w:bookmarkEnd w:id="41"/>
+    <w:bookmarkStart w:id="42" w:name="lingkungan-operasi"/>
     <w:p>
       <w:pPr>
         <w:pStyle w:val="Heading2"/>
@@ -2661,8 +3332,8 @@
         </w:tc>
       </w:tr>
     </w:tbl>
-    <w:bookmarkEnd w:id="35"/>
-    <w:bookmarkStart w:id="36" w:name="asumsi-dan-ketergantungan"/>
+    <w:bookmarkEnd w:id="42"/>
+    <w:bookmarkStart w:id="43" w:name="asumsi-dan-ketergantungan"/>
     <w:p>
       <w:pPr>
         <w:pStyle w:val="Heading2"/>
@@ -2778,9 +3449,9 @@
         <w:t xml:space="preserve">Penyimpanan file PDF (surat permohonan, surat bebas lab, gambar Petunjuk) disimpan di filesystem lokal; backup tergantung pada strategi backup server.</w:t>
       </w:r>
     </w:p>
-    <w:bookmarkEnd w:id="36"/>
-    <w:bookmarkEnd w:id="37"/>
-    <w:bookmarkStart w:id="121" w:name="persyaratan-fungsional"/>
+    <w:bookmarkEnd w:id="43"/>
+    <w:bookmarkEnd w:id="44"/>
+    <w:bookmarkStart w:id="128" w:name="persyaratan-fungsional"/>
     <w:p>
       <w:pPr>
         <w:pStyle w:val="Heading1"/>
@@ -2798,7 +3469,7 @@
         <w:t xml:space="preserve">3. Persyaratan Fungsional</w:t>
       </w:r>
     </w:p>
-    <w:bookmarkStart w:id="38" w:name="konvensi-penomoran"/>
+    <w:bookmarkStart w:id="45" w:name="konvensi-penomoran"/>
     <w:p>
       <w:pPr>
         <w:pStyle w:val="Heading2"/>
@@ -2919,8 +3590,8 @@
         <w:t xml:space="preserve">: kondisi terverifikasi</w:t>
       </w:r>
     </w:p>
-    <w:bookmarkEnd w:id="38"/>
-    <w:bookmarkStart w:id="44" w:name="modul-otentikasi-auth"/>
+    <w:bookmarkEnd w:id="45"/>
+    <w:bookmarkStart w:id="51" w:name="modul-otentikasi-auth"/>
     <w:p>
       <w:pPr>
         <w:pStyle w:val="Heading2"/>
@@ -2938,7 +3609,7 @@
         <w:t xml:space="preserve">3.2 Modul Otentikasi (AUTH)</w:t>
       </w:r>
     </w:p>
-    <w:bookmarkStart w:id="39" w:name="Xa11b362c8ef178ae863fe340ae368ed97c26167"/>
+    <w:bookmarkStart w:id="46" w:name="Xa11b362c8ef178ae863fe340ae368ed97c26167"/>
     <w:p>
       <w:pPr>
         <w:pStyle w:val="Heading3"/>
@@ -3158,8 +3829,8 @@
         <w:t xml:space="preserve">valid.</w:t>
       </w:r>
     </w:p>
-    <w:bookmarkEnd w:id="39"/>
-    <w:bookmarkStart w:id="40" w:name="Xf9d2410c94dcb4643ea167eaef59de8f76d33fc"/>
+    <w:bookmarkEnd w:id="46"/>
+    <w:bookmarkStart w:id="47" w:name="Xf9d2410c94dcb4643ea167eaef59de8f76d33fc"/>
     <w:p>
       <w:pPr>
         <w:pStyle w:val="Heading3"/>
@@ -3296,8 +3967,8 @@
         <w:t xml:space="preserve">.</w:t>
       </w:r>
     </w:p>
-    <w:bookmarkEnd w:id="40"/>
-    <w:bookmarkStart w:id="41" w:name="fr-auth-003-logout-tunggal"/>
+    <w:bookmarkEnd w:id="47"/>
+    <w:bookmarkStart w:id="48" w:name="fr-auth-003-logout-tunggal"/>
     <w:p>
       <w:pPr>
         <w:pStyle w:val="Heading3"/>
@@ -3463,8 +4134,8 @@
         <w:t xml:space="preserve">dihapus dan akses kembali memerlukan otentikasi ulang IdP.</w:t>
       </w:r>
     </w:p>
-    <w:bookmarkEnd w:id="41"/>
-    <w:bookmarkStart w:id="42" w:name="fr-auth-004-resolusi-identitas-otomatis"/>
+    <w:bookmarkEnd w:id="48"/>
+    <w:bookmarkStart w:id="49" w:name="fr-auth-004-resolusi-identitas-otomatis"/>
     <w:p>
       <w:pPr>
         <w:pStyle w:val="Heading3"/>
@@ -3667,8 +4338,8 @@
         <w:t xml:space="preserve">yang konsisten dengan atribut SSO setelah login pertama.</w:t>
       </w:r>
     </w:p>
-    <w:bookmarkEnd w:id="42"/>
-    <w:bookmarkStart w:id="43" w:name="fr-auth-005-endpoint-profil-pengguna"/>
+    <w:bookmarkEnd w:id="49"/>
+    <w:bookmarkStart w:id="50" w:name="fr-auth-005-endpoint-profil-pengguna"/>
     <w:p>
       <w:pPr>
         <w:pStyle w:val="Heading3"/>
@@ -3800,9 +4471,9 @@
         <w:t xml:space="preserve">: TINGGI</w:t>
       </w:r>
     </w:p>
-    <w:bookmarkEnd w:id="43"/>
-    <w:bookmarkEnd w:id="44"/>
-    <w:bookmarkStart w:id="50" w:name="modul-manajemen-pengguna-peran-user"/>
+    <w:bookmarkEnd w:id="50"/>
+    <w:bookmarkEnd w:id="51"/>
+    <w:bookmarkStart w:id="57" w:name="modul-manajemen-pengguna-peran-user"/>
     <w:p>
       <w:pPr>
         <w:pStyle w:val="Heading2"/>
@@ -3820,7 +4491,7 @@
         <w:t xml:space="preserve">3.3 Modul Manajemen Pengguna &amp; Peran (USER)</w:t>
       </w:r>
     </w:p>
-    <w:bookmarkStart w:id="45" w:name="fr-user-001-daftar-pengguna"/>
+    <w:bookmarkStart w:id="52" w:name="fr-user-001-daftar-pengguna"/>
     <w:p>
       <w:pPr>
         <w:pStyle w:val="Heading3"/>
@@ -3911,8 +4582,8 @@
         <w:t xml:space="preserve">: TINGGI</w:t>
       </w:r>
     </w:p>
-    <w:bookmarkEnd w:id="45"/>
-    <w:bookmarkStart w:id="46" w:name="fr-user-002-penugasan-peran"/>
+    <w:bookmarkEnd w:id="52"/>
+    <w:bookmarkStart w:id="53" w:name="fr-user-002-penugasan-peran"/>
     <w:p>
       <w:pPr>
         <w:pStyle w:val="Heading3"/>
@@ -4084,8 +4755,8 @@
         <w:t xml:space="preserve">.</w:t>
       </w:r>
     </w:p>
-    <w:bookmarkEnd w:id="46"/>
-    <w:bookmarkStart w:id="47" w:name="fr-user-003-pembaruan-profil-mandiri"/>
+    <w:bookmarkEnd w:id="53"/>
+    <w:bookmarkStart w:id="54" w:name="fr-user-003-pembaruan-profil-mandiri"/>
     <w:p>
       <w:pPr>
         <w:pStyle w:val="Heading3"/>
@@ -4250,8 +4921,8 @@
         <w:t xml:space="preserve">) hanya bisa diubah oleh administrator.</w:t>
       </w:r>
     </w:p>
-    <w:bookmarkEnd w:id="47"/>
-    <w:bookmarkStart w:id="48" w:name="fr-user-004-penonaktifan-pengguna"/>
+    <w:bookmarkEnd w:id="54"/>
+    <w:bookmarkStart w:id="55" w:name="fr-user-004-penonaktifan-pengguna"/>
     <w:p>
       <w:pPr>
         <w:pStyle w:val="Heading3"/>
@@ -4351,8 +5022,8 @@
         <w:t xml:space="preserve">: SEDANG</w:t>
       </w:r>
     </w:p>
-    <w:bookmarkEnd w:id="48"/>
-    <w:bookmarkStart w:id="49" w:name="X436daef0822faaf42ca7cda765ae694ffa99e14"/>
+    <w:bookmarkEnd w:id="55"/>
+    <w:bookmarkStart w:id="56" w:name="X436daef0822faaf42ca7cda765ae694ffa99e14"/>
     <w:p>
       <w:pPr>
         <w:pStyle w:val="Heading3"/>
@@ -4452,9 +5123,9 @@
         <w:t xml:space="preserve">: TINGGI</w:t>
       </w:r>
     </w:p>
-    <w:bookmarkEnd w:id="49"/>
-    <w:bookmarkEnd w:id="50"/>
-    <w:bookmarkStart w:id="55" w:name="modul-manajemen-laboratorium-ruangan-lab"/>
+    <w:bookmarkEnd w:id="56"/>
+    <w:bookmarkEnd w:id="57"/>
+    <w:bookmarkStart w:id="62" w:name="modul-manajemen-laboratorium-ruangan-lab"/>
     <w:p>
       <w:pPr>
         <w:pStyle w:val="Heading2"/>
@@ -4472,7 +5143,7 @@
         <w:t xml:space="preserve">3.4 Modul Manajemen Laboratorium &amp; Ruangan (LAB)</w:t>
       </w:r>
     </w:p>
-    <w:bookmarkStart w:id="51" w:name="fr-lab-001-daftar-laboratorium"/>
+    <w:bookmarkStart w:id="58" w:name="fr-lab-001-daftar-laboratorium"/>
     <w:p>
       <w:pPr>
         <w:pStyle w:val="Heading3"/>
@@ -4563,8 +5234,8 @@
         <w:t xml:space="preserve">: TINGGI</w:t>
       </w:r>
     </w:p>
-    <w:bookmarkEnd w:id="51"/>
-    <w:bookmarkStart w:id="52" w:name="fr-lab-002-penugasan-kepala-lab"/>
+    <w:bookmarkEnd w:id="58"/>
+    <w:bookmarkStart w:id="59" w:name="fr-lab-002-penugasan-kepala-lab"/>
     <w:p>
       <w:pPr>
         <w:pStyle w:val="Heading3"/>
@@ -4655,8 +5326,8 @@
         <w:t xml:space="preserve">: TINGGI</w:t>
       </w:r>
     </w:p>
-    <w:bookmarkEnd w:id="52"/>
-    <w:bookmarkStart w:id="53" w:name="X3087c94960903b059633664633c1cb9a075f3c8"/>
+    <w:bookmarkEnd w:id="59"/>
+    <w:bookmarkStart w:id="60" w:name="X3087c94960903b059633664633c1cb9a075f3c8"/>
     <w:p>
       <w:pPr>
         <w:pStyle w:val="Heading3"/>
@@ -4766,8 +5437,8 @@
         <w:t xml:space="preserve">: Satu laboran melayani satu laboratorium; satu Kepala Lab dapat memimpin lebih dari satu laboratorium.</w:t>
       </w:r>
     </w:p>
-    <w:bookmarkEnd w:id="53"/>
-    <w:bookmarkStart w:id="54" w:name="fr-lab-004-daftar-ruangan"/>
+    <w:bookmarkEnd w:id="60"/>
+    <w:bookmarkStart w:id="61" w:name="fr-lab-004-daftar-ruangan"/>
     <w:p>
       <w:pPr>
         <w:pStyle w:val="Heading3"/>
@@ -4858,9 +5529,9 @@
         <w:t xml:space="preserve">: TINGGI</w:t>
       </w:r>
     </w:p>
-    <w:bookmarkEnd w:id="54"/>
-    <w:bookmarkEnd w:id="55"/>
-    <w:bookmarkStart w:id="60" w:name="modul-aset-laptop-asset"/>
+    <w:bookmarkEnd w:id="61"/>
+    <w:bookmarkEnd w:id="62"/>
+    <w:bookmarkStart w:id="67" w:name="modul-aset-laptop-asset"/>
     <w:p>
       <w:pPr>
         <w:pStyle w:val="Heading2"/>
@@ -4878,7 +5549,7 @@
         <w:t xml:space="preserve">3.5 Modul Aset Laptop (ASSET)</w:t>
       </w:r>
     </w:p>
-    <w:bookmarkStart w:id="56" w:name="fr-asset-001-pendaftaran-laptop"/>
+    <w:bookmarkStart w:id="63" w:name="fr-asset-001-pendaftaran-laptop"/>
     <w:p>
       <w:pPr>
         <w:pStyle w:val="Heading3"/>
@@ -4969,8 +5640,8 @@
         <w:t xml:space="preserve">: TINGGI</w:t>
       </w:r>
     </w:p>
-    <w:bookmarkEnd w:id="56"/>
-    <w:bookmarkStart w:id="57" w:name="fr-asset-002-pengubahan-status-kondisi"/>
+    <w:bookmarkEnd w:id="63"/>
+    <w:bookmarkStart w:id="64" w:name="fr-asset-002-pengubahan-status-kondisi"/>
     <w:p>
       <w:pPr>
         <w:pStyle w:val="Heading3"/>
@@ -5061,8 +5732,8 @@
         <w:t xml:space="preserve">: TINGGI</w:t>
       </w:r>
     </w:p>
-    <w:bookmarkEnd w:id="57"/>
-    <w:bookmarkStart w:id="58" w:name="fr-asset-003-penghapusan-laptop"/>
+    <w:bookmarkEnd w:id="64"/>
+    <w:bookmarkStart w:id="65" w:name="fr-asset-003-penghapusan-laptop"/>
     <w:p>
       <w:pPr>
         <w:pStyle w:val="Heading3"/>
@@ -5153,8 +5824,8 @@
         <w:t xml:space="preserve">: SEDANG</w:t>
       </w:r>
     </w:p>
-    <w:bookmarkEnd w:id="58"/>
-    <w:bookmarkStart w:id="59" w:name="fr-asset-004-tautan-qr-verifikasi"/>
+    <w:bookmarkEnd w:id="65"/>
+    <w:bookmarkStart w:id="66" w:name="fr-asset-004-tautan-qr-verifikasi"/>
     <w:p>
       <w:pPr>
         <w:pStyle w:val="Heading3"/>
@@ -5245,9 +5916,9 @@
         <w:t xml:space="preserve">: SEDANG</w:t>
       </w:r>
     </w:p>
-    <w:bookmarkEnd w:id="59"/>
-    <w:bookmarkEnd w:id="60"/>
-    <w:bookmarkStart w:id="71" w:name="modul-peminjaman-laptop-loan"/>
+    <w:bookmarkEnd w:id="66"/>
+    <w:bookmarkEnd w:id="67"/>
+    <w:bookmarkStart w:id="78" w:name="modul-peminjaman-laptop-loan"/>
     <w:p>
       <w:pPr>
         <w:pStyle w:val="Heading2"/>
@@ -5265,7 +5936,7 @@
         <w:t xml:space="preserve">3.6 Modul Peminjaman Laptop (LOAN)</w:t>
       </w:r>
     </w:p>
-    <w:bookmarkStart w:id="61" w:name="fr-loan-001-pengajuan-peminjaman-ta"/>
+    <w:bookmarkStart w:id="68" w:name="fr-loan-001-pengajuan-peminjaman-ta"/>
     <w:p>
       <w:pPr>
         <w:pStyle w:val="Heading3"/>
@@ -5411,8 +6082,8 @@
         <w:t xml:space="preserve">Notifikasi otomatis dikirim ke dosen pembimbing.</w:t>
       </w:r>
     </w:p>
-    <w:bookmarkEnd w:id="61"/>
-    <w:bookmarkStart w:id="62" w:name="fr-loan-002-persetujuan-tahap-dosen"/>
+    <w:bookmarkEnd w:id="68"/>
+    <w:bookmarkStart w:id="69" w:name="fr-loan-002-persetujuan-tahap-dosen"/>
     <w:p>
       <w:pPr>
         <w:pStyle w:val="Heading3"/>
@@ -5588,8 +6259,8 @@
         <w:t xml:space="preserve">Notifikasi otomatis dikirim ke mahasiswa dan ke Kepala Lab (jika disetujui).</w:t>
       </w:r>
     </w:p>
-    <w:bookmarkEnd w:id="62"/>
-    <w:bookmarkStart w:id="63" w:name="fr-loan-003-persetujuan-tahap-kepala-lab"/>
+    <w:bookmarkEnd w:id="69"/>
+    <w:bookmarkStart w:id="70" w:name="fr-loan-003-persetujuan-tahap-kepala-lab"/>
     <w:p>
       <w:pPr>
         <w:pStyle w:val="Heading3"/>
@@ -5738,8 +6409,8 @@
         <w:t xml:space="preserve">Notifikasi otomatis dikirim ke mahasiswa dan ke laboran.</w:t>
       </w:r>
     </w:p>
-    <w:bookmarkEnd w:id="63"/>
-    <w:bookmarkStart w:id="64" w:name="fr-loan-004-serah-aset-oleh-laboran"/>
+    <w:bookmarkEnd w:id="70"/>
+    <w:bookmarkStart w:id="71" w:name="fr-loan-004-serah-aset-oleh-laboran"/>
     <w:p>
       <w:pPr>
         <w:pStyle w:val="Heading3"/>
@@ -5961,8 +6632,8 @@
         <w:t xml:space="preserve">) tercatat.</w:t>
       </w:r>
     </w:p>
-    <w:bookmarkEnd w:id="64"/>
-    <w:bookmarkStart w:id="65" w:name="fr-loan-005-pencatatan-pengembalian"/>
+    <w:bookmarkEnd w:id="71"/>
+    <w:bookmarkStart w:id="72" w:name="fr-loan-005-pencatatan-pengembalian"/>
     <w:p>
       <w:pPr>
         <w:pStyle w:val="Heading3"/>
@@ -6177,8 +6848,8 @@
         <w:t xml:space="preserve">.</w:t>
       </w:r>
     </w:p>
-    <w:bookmarkEnd w:id="65"/>
-    <w:bookmarkStart w:id="66" w:name="Xa2231e8ad2098cd9e43a10b92c9f1d8de423958"/>
+    <w:bookmarkEnd w:id="72"/>
+    <w:bookmarkStart w:id="73" w:name="Xa2231e8ad2098cd9e43a10b92c9f1d8de423958"/>
     <w:p>
       <w:pPr>
         <w:pStyle w:val="Heading3"/>
@@ -6285,8 +6956,8 @@
         <w:t xml:space="preserve">: TINGGI</w:t>
       </w:r>
     </w:p>
-    <w:bookmarkEnd w:id="66"/>
-    <w:bookmarkStart w:id="67" w:name="fr-loan-007-perpanjangan-peminjaman"/>
+    <w:bookmarkEnd w:id="73"/>
+    <w:bookmarkStart w:id="74" w:name="fr-loan-007-perpanjangan-peminjaman"/>
     <w:p>
       <w:pPr>
         <w:pStyle w:val="Heading3"/>
@@ -6408,8 +7079,8 @@
         <w:t xml:space="preserve">: SEDANG</w:t>
       </w:r>
     </w:p>
-    <w:bookmarkEnd w:id="67"/>
-    <w:bookmarkStart w:id="68" w:name="fr-loan-008-penandaan-status-denda"/>
+    <w:bookmarkEnd w:id="74"/>
+    <w:bookmarkStart w:id="75" w:name="fr-loan-008-penandaan-status-denda"/>
     <w:p>
       <w:pPr>
         <w:pStyle w:val="Heading3"/>
@@ -6600,8 +7271,8 @@
         <w:t xml:space="preserve">tidak dapat menerbitkan Surat Bebas Lab (lihat FR-CLEAR-001).</w:t>
       </w:r>
     </w:p>
-    <w:bookmarkEnd w:id="68"/>
-    <w:bookmarkStart w:id="69" w:name="fr-loan-009-status-otomatis-overdue"/>
+    <w:bookmarkEnd w:id="75"/>
+    <w:bookmarkStart w:id="76" w:name="fr-loan-009-status-otomatis-overdue"/>
     <w:p>
       <w:pPr>
         <w:pStyle w:val="Heading3"/>
@@ -6722,8 +7393,8 @@
         <w:t xml:space="preserve">: TINGGI</w:t>
       </w:r>
     </w:p>
-    <w:bookmarkEnd w:id="69"/>
-    <w:bookmarkStart w:id="70" w:name="fr-loan-010-tampilan-riwayat-peminjaman"/>
+    <w:bookmarkEnd w:id="76"/>
+    <w:bookmarkStart w:id="77" w:name="fr-loan-010-tampilan-riwayat-peminjaman"/>
     <w:p>
       <w:pPr>
         <w:pStyle w:val="Heading3"/>
@@ -6814,9 +7485,9 @@
         <w:t xml:space="preserve">: TINGGI</w:t>
       </w:r>
     </w:p>
-    <w:bookmarkEnd w:id="70"/>
-    <w:bookmarkEnd w:id="71"/>
-    <w:bookmarkStart w:id="76" w:name="modul-peminjaman-alat-eloan"/>
+    <w:bookmarkEnd w:id="77"/>
+    <w:bookmarkEnd w:id="78"/>
+    <w:bookmarkStart w:id="83" w:name="modul-peminjaman-alat-eloan"/>
     <w:p>
       <w:pPr>
         <w:pStyle w:val="Heading2"/>
@@ -6834,7 +7505,7 @@
         <w:t xml:space="preserve">3.7 Modul Peminjaman Alat (ELOAN)</w:t>
       </w:r>
     </w:p>
-    <w:bookmarkStart w:id="72" w:name="fr-eloan-001-pendaftaran-alat"/>
+    <w:bookmarkStart w:id="79" w:name="fr-eloan-001-pendaftaran-alat"/>
     <w:p>
       <w:pPr>
         <w:pStyle w:val="Heading3"/>
@@ -6925,8 +7596,8 @@
         <w:t xml:space="preserve">: TINGGI</w:t>
       </w:r>
     </w:p>
-    <w:bookmarkEnd w:id="72"/>
-    <w:bookmarkStart w:id="73" w:name="Xc97e4670bad7125eff768e2dbdfb956d2d91b56"/>
+    <w:bookmarkEnd w:id="79"/>
+    <w:bookmarkStart w:id="80" w:name="Xc97e4670bad7125eff768e2dbdfb956d2d91b56"/>
     <w:p>
       <w:pPr>
         <w:pStyle w:val="Heading3"/>
@@ -7017,8 +7688,8 @@
         <w:t xml:space="preserve">: TINGGI</w:t>
       </w:r>
     </w:p>
-    <w:bookmarkEnd w:id="73"/>
-    <w:bookmarkStart w:id="74" w:name="fr-eloan-003-persetujuan-aktivasi"/>
+    <w:bookmarkEnd w:id="80"/>
+    <w:bookmarkStart w:id="81" w:name="fr-eloan-003-persetujuan-aktivasi"/>
     <w:p>
       <w:pPr>
         <w:pStyle w:val="Heading3"/>
@@ -7109,8 +7780,8 @@
         <w:t xml:space="preserve">: TINGGI</w:t>
       </w:r>
     </w:p>
-    <w:bookmarkEnd w:id="74"/>
-    <w:bookmarkStart w:id="75" w:name="X2d4cdc4ab52f7c1c516b79f620b193d83a1b36f"/>
+    <w:bookmarkEnd w:id="81"/>
+    <w:bookmarkStart w:id="82" w:name="X2d4cdc4ab52f7c1c516b79f620b193d83a1b36f"/>
     <w:p>
       <w:pPr>
         <w:pStyle w:val="Heading3"/>
@@ -7201,9 +7872,9 @@
         <w:t xml:space="preserve">: TINGGI</w:t>
       </w:r>
     </w:p>
-    <w:bookmarkEnd w:id="75"/>
-    <w:bookmarkEnd w:id="76"/>
-    <w:bookmarkStart w:id="83" w:name="modul-reservasi-ruangan-resv"/>
+    <w:bookmarkEnd w:id="82"/>
+    <w:bookmarkEnd w:id="83"/>
+    <w:bookmarkStart w:id="90" w:name="modul-reservasi-ruangan-resv"/>
     <w:p>
       <w:pPr>
         <w:pStyle w:val="Heading2"/>
@@ -7221,7 +7892,7 @@
         <w:t xml:space="preserve">3.8 Modul Reservasi Ruangan (RESV)</w:t>
       </w:r>
     </w:p>
-    <w:bookmarkStart w:id="77" w:name="fr-resv-001-pengajuan-reservasi"/>
+    <w:bookmarkStart w:id="84" w:name="fr-resv-001-pengajuan-reservasi"/>
     <w:p>
       <w:pPr>
         <w:pStyle w:val="Heading3"/>
@@ -7379,8 +8050,8 @@
         <w:t xml:space="preserve">Notifikasi otomatis dikirim ke laboran.</w:t>
       </w:r>
     </w:p>
-    <w:bookmarkEnd w:id="77"/>
-    <w:bookmarkStart w:id="78" w:name="fr-resv-002-pengecekan-oleh-laboran"/>
+    <w:bookmarkEnd w:id="84"/>
+    <w:bookmarkStart w:id="85" w:name="fr-resv-002-pengecekan-oleh-laboran"/>
     <w:p>
       <w:pPr>
         <w:pStyle w:val="Heading3"/>
@@ -7501,8 +8172,8 @@
         <w:t xml:space="preserve">: TINGGI</w:t>
       </w:r>
     </w:p>
-    <w:bookmarkEnd w:id="78"/>
-    <w:bookmarkStart w:id="79" w:name="X6cae2311811585788f93158e3418e64c0954659"/>
+    <w:bookmarkEnd w:id="85"/>
+    <w:bookmarkStart w:id="86" w:name="X6cae2311811585788f93158e3418e64c0954659"/>
     <w:p>
       <w:pPr>
         <w:pStyle w:val="Heading3"/>
@@ -7611,8 +8282,8 @@
         <w:t xml:space="preserve">: TINGGI</w:t>
       </w:r>
     </w:p>
-    <w:bookmarkEnd w:id="79"/>
-    <w:bookmarkStart w:id="80" w:name="fr-resv-004-pratinjau-surat-permohonan"/>
+    <w:bookmarkEnd w:id="86"/>
+    <w:bookmarkStart w:id="87" w:name="fr-resv-004-pratinjau-surat-permohonan"/>
     <w:p>
       <w:pPr>
         <w:pStyle w:val="Heading3"/>
@@ -7703,8 +8374,8 @@
         <w:t xml:space="preserve">: SEDANG</w:t>
       </w:r>
     </w:p>
-    <w:bookmarkEnd w:id="80"/>
-    <w:bookmarkStart w:id="81" w:name="fr-resv-005-pencegahan-konflik-jadwal"/>
+    <w:bookmarkEnd w:id="87"/>
+    <w:bookmarkStart w:id="88" w:name="fr-resv-005-pencegahan-konflik-jadwal"/>
     <w:p>
       <w:pPr>
         <w:pStyle w:val="Heading3"/>
@@ -7795,8 +8466,8 @@
         <w:t xml:space="preserve">: SEDANG</w:t>
       </w:r>
     </w:p>
-    <w:bookmarkEnd w:id="81"/>
-    <w:bookmarkStart w:id="82" w:name="fr-resv-006-pembatalan-mandiri"/>
+    <w:bookmarkEnd w:id="88"/>
+    <w:bookmarkStart w:id="89" w:name="fr-resv-006-pembatalan-mandiri"/>
     <w:p>
       <w:pPr>
         <w:pStyle w:val="Heading3"/>
@@ -7926,9 +8597,9 @@
         <w:t xml:space="preserve">: SEDANG</w:t>
       </w:r>
     </w:p>
-    <w:bookmarkEnd w:id="82"/>
-    <w:bookmarkEnd w:id="83"/>
-    <w:bookmarkStart w:id="90" w:name="modul-surat-bebas-lab-clear"/>
+    <w:bookmarkEnd w:id="89"/>
+    <w:bookmarkEnd w:id="90"/>
+    <w:bookmarkStart w:id="97" w:name="modul-surat-bebas-lab-clear"/>
     <w:p>
       <w:pPr>
         <w:pStyle w:val="Heading2"/>
@@ -7946,7 +8617,7 @@
         <w:t xml:space="preserve">3.9 Modul Surat Bebas Lab (CLEAR)</w:t>
       </w:r>
     </w:p>
-    <w:bookmarkStart w:id="84" w:name="fr-clear-001-pengajuan-surat"/>
+    <w:bookmarkStart w:id="91" w:name="fr-clear-001-pengajuan-surat"/>
     <w:p>
       <w:pPr>
         <w:pStyle w:val="Heading3"/>
@@ -8099,8 +8770,8 @@
         <w:t xml:space="preserve">, atau alat belum dikembalikan).</w:t>
       </w:r>
     </w:p>
-    <w:bookmarkEnd w:id="84"/>
-    <w:bookmarkStart w:id="85" w:name="Xbc9cf1277641ec2ebb2d5108c4754851dff027d"/>
+    <w:bookmarkEnd w:id="91"/>
+    <w:bookmarkStart w:id="92" w:name="Xbc9cf1277641ec2ebb2d5108c4754851dff027d"/>
     <w:p>
       <w:pPr>
         <w:pStyle w:val="Heading3"/>
@@ -8212,8 +8883,8 @@
         <w:t xml:space="preserve">: TINGGI</w:t>
       </w:r>
     </w:p>
-    <w:bookmarkEnd w:id="85"/>
-    <w:bookmarkStart w:id="86" w:name="fr-clear-003-pengesahan-oleh-kepala-lab"/>
+    <w:bookmarkEnd w:id="92"/>
+    <w:bookmarkStart w:id="93" w:name="fr-clear-003-pengesahan-oleh-kepala-lab"/>
     <w:p>
       <w:pPr>
         <w:pStyle w:val="Heading3"/>
@@ -8325,8 +8996,8 @@
         <w:t xml:space="preserve">: TINGGI</w:t>
       </w:r>
     </w:p>
-    <w:bookmarkEnd w:id="86"/>
-    <w:bookmarkStart w:id="87" w:name="fr-clear-004-generasi-surat-pdf"/>
+    <w:bookmarkEnd w:id="93"/>
+    <w:bookmarkStart w:id="94" w:name="fr-clear-004-generasi-surat-pdf"/>
     <w:p>
       <w:pPr>
         <w:pStyle w:val="Heading3"/>
@@ -8430,8 +9101,8 @@
         <w:t xml:space="preserve">: TINGGI</w:t>
       </w:r>
     </w:p>
-    <w:bookmarkEnd w:id="87"/>
-    <w:bookmarkStart w:id="88" w:name="fr-clear-005-verifikasi-publik-via-qr"/>
+    <w:bookmarkEnd w:id="94"/>
+    <w:bookmarkStart w:id="95" w:name="fr-clear-005-verifikasi-publik-via-qr"/>
     <w:p>
       <w:pPr>
         <w:pStyle w:val="Heading3"/>
@@ -8531,8 +9202,8 @@
         <w:t xml:space="preserve">: TINGGI</w:t>
       </w:r>
     </w:p>
-    <w:bookmarkEnd w:id="88"/>
-    <w:bookmarkStart w:id="89" w:name="fr-clear-006-unduh-ulang-surat"/>
+    <w:bookmarkEnd w:id="95"/>
+    <w:bookmarkStart w:id="96" w:name="fr-clear-006-unduh-ulang-surat"/>
     <w:p>
       <w:pPr>
         <w:pStyle w:val="Heading3"/>
@@ -8621,597 +9292,11 @@
       </w:r>
       <w:r>
         <w:t xml:space="preserve">: SEDANG</w:t>
-      </w:r>
-    </w:p>
-    <w:bookmarkEnd w:id="89"/>
-    <w:bookmarkEnd w:id="90"/>
-    <w:bookmarkStart w:id="97" w:name="modul-habis-pakai-cons"/>
-    <w:p>
-      <w:pPr>
-        <w:pStyle w:val="Heading2"/>
-      </w:pPr>
-      <w:r>
-        <w:rPr>
-          <w:rStyle w:val="SectionNumber"/>
-        </w:rPr>
-        <w:t xml:space="preserve">3.10</w:t>
-      </w:r>
-      <w:r>
-        <w:tab/>
-      </w:r>
-      <w:r>
-        <w:t xml:space="preserve">3.10 Modul Habis Pakai (CONS)</w:t>
-      </w:r>
-    </w:p>
-    <w:bookmarkStart w:id="91" w:name="fr-cons-001-pendaftaran-item"/>
-    <w:p>
-      <w:pPr>
-        <w:pStyle w:val="Heading3"/>
-      </w:pPr>
-      <w:r>
-        <w:rPr>
-          <w:rStyle w:val="SectionNumber"/>
-        </w:rPr>
-        <w:t xml:space="preserve">3.10.1</w:t>
-      </w:r>
-      <w:r>
-        <w:tab/>
-      </w:r>
-      <w:r>
-        <w:t xml:space="preserve">FR-CONS-001 — Pendaftaran Item</w:t>
-      </w:r>
-    </w:p>
-    <w:p>
-      <w:pPr>
-        <w:numPr>
-          <w:ilvl w:val="0"/>
-          <w:numId w:val="1067"/>
-        </w:numPr>
-        <w:pStyle w:val="Compact"/>
-      </w:pPr>
-      <w:r>
-        <w:rPr>
-          <w:bCs/>
-          <w:b/>
-        </w:rPr>
-        <w:t xml:space="preserve">Aktor</w:t>
-      </w:r>
-      <w:r>
-        <w:t xml:space="preserve">: Laboran, Kepala Lab, Super Admin</w:t>
-      </w:r>
-    </w:p>
-    <w:p>
-      <w:pPr>
-        <w:numPr>
-          <w:ilvl w:val="0"/>
-          <w:numId w:val="1067"/>
-        </w:numPr>
-        <w:pStyle w:val="Compact"/>
-      </w:pPr>
-      <w:r>
-        <w:rPr>
-          <w:bCs/>
-          <w:b/>
-        </w:rPr>
-        <w:t xml:space="preserve">Deskripsi</w:t>
-      </w:r>
-      <w:r>
-        <w:t xml:space="preserve">: Sistem</w:t>
-      </w:r>
-      <w:r>
-        <w:t xml:space="preserve"> </w:t>
-      </w:r>
-      <w:r>
-        <w:rPr>
-          <w:bCs/>
-          <w:b/>
-        </w:rPr>
-        <w:t xml:space="preserve">harus</w:t>
-      </w:r>
-      <w:r>
-        <w:t xml:space="preserve"> </w:t>
-      </w:r>
-      <w:r>
-        <w:t xml:space="preserve">memungkinkan pencatatan item habis pakai dengan satuan, stok, dan stok minimum.</w:t>
-      </w:r>
-    </w:p>
-    <w:p>
-      <w:pPr>
-        <w:numPr>
-          <w:ilvl w:val="0"/>
-          <w:numId w:val="1067"/>
-        </w:numPr>
-        <w:pStyle w:val="Compact"/>
-      </w:pPr>
-      <w:r>
-        <w:rPr>
-          <w:bCs/>
-          <w:b/>
-        </w:rPr>
-        <w:t xml:space="preserve">Prioritas</w:t>
-      </w:r>
-      <w:r>
-        <w:t xml:space="preserve">: TINGGI</w:t>
-      </w:r>
-    </w:p>
-    <w:bookmarkEnd w:id="91"/>
-    <w:bookmarkStart w:id="92" w:name="fr-cons-002-transaksi-penambahan-stok-in"/>
-    <w:p>
-      <w:pPr>
-        <w:pStyle w:val="Heading3"/>
-      </w:pPr>
-      <w:r>
-        <w:rPr>
-          <w:rStyle w:val="SectionNumber"/>
-        </w:rPr>
-        <w:t xml:space="preserve">3.10.2</w:t>
-      </w:r>
-      <w:r>
-        <w:tab/>
-      </w:r>
-      <w:r>
-        <w:t xml:space="preserve">FR-CONS-002 — Transaksi Penambahan Stok (IN)</w:t>
-      </w:r>
-    </w:p>
-    <w:p>
-      <w:pPr>
-        <w:numPr>
-          <w:ilvl w:val="0"/>
-          <w:numId w:val="1068"/>
-        </w:numPr>
-        <w:pStyle w:val="Compact"/>
-      </w:pPr>
-      <w:r>
-        <w:rPr>
-          <w:bCs/>
-          <w:b/>
-        </w:rPr>
-        <w:t xml:space="preserve">Aktor</w:t>
-      </w:r>
-      <w:r>
-        <w:t xml:space="preserve">: Laboran, Kepala Lab, Super Admin</w:t>
-      </w:r>
-    </w:p>
-    <w:p>
-      <w:pPr>
-        <w:numPr>
-          <w:ilvl w:val="0"/>
-          <w:numId w:val="1068"/>
-        </w:numPr>
-        <w:pStyle w:val="Compact"/>
-      </w:pPr>
-      <w:r>
-        <w:rPr>
-          <w:bCs/>
-          <w:b/>
-        </w:rPr>
-        <w:t xml:space="preserve">Deskripsi</w:t>
-      </w:r>
-      <w:r>
-        <w:t xml:space="preserve">: Sistem</w:t>
-      </w:r>
-      <w:r>
-        <w:t xml:space="preserve"> </w:t>
-      </w:r>
-      <w:r>
-        <w:rPr>
-          <w:bCs/>
-          <w:b/>
-        </w:rPr>
-        <w:t xml:space="preserve">harus</w:t>
-      </w:r>
-      <w:r>
-        <w:t xml:space="preserve"> </w:t>
-      </w:r>
-      <w:r>
-        <w:t xml:space="preserve">memungkinkan pencatatan transaksi penambahan stok dengan catatan opsional.</w:t>
-      </w:r>
-    </w:p>
-    <w:p>
-      <w:pPr>
-        <w:numPr>
-          <w:ilvl w:val="0"/>
-          <w:numId w:val="1068"/>
-        </w:numPr>
-        <w:pStyle w:val="Compact"/>
-      </w:pPr>
-      <w:r>
-        <w:rPr>
-          <w:bCs/>
-          <w:b/>
-        </w:rPr>
-        <w:t xml:space="preserve">Prioritas</w:t>
-      </w:r>
-      <w:r>
-        <w:t xml:space="preserve">: TINGGI</w:t>
-      </w:r>
-    </w:p>
-    <w:bookmarkEnd w:id="92"/>
-    <w:bookmarkStart w:id="93" w:name="fr-cons-003-transaksi-penyaluran-out"/>
-    <w:p>
-      <w:pPr>
-        <w:pStyle w:val="Heading3"/>
-      </w:pPr>
-      <w:r>
-        <w:rPr>
-          <w:rStyle w:val="SectionNumber"/>
-        </w:rPr>
-        <w:t xml:space="preserve">3.10.3</w:t>
-      </w:r>
-      <w:r>
-        <w:tab/>
-      </w:r>
-      <w:r>
-        <w:t xml:space="preserve">FR-CONS-003 — Transaksi Penyaluran (OUT)</w:t>
-      </w:r>
-    </w:p>
-    <w:p>
-      <w:pPr>
-        <w:numPr>
-          <w:ilvl w:val="0"/>
-          <w:numId w:val="1069"/>
-        </w:numPr>
-        <w:pStyle w:val="Compact"/>
-      </w:pPr>
-      <w:r>
-        <w:rPr>
-          <w:bCs/>
-          <w:b/>
-        </w:rPr>
-        <w:t xml:space="preserve">Aktor</w:t>
-      </w:r>
-      <w:r>
-        <w:t xml:space="preserve">: Laboran, Kepala Lab, Super Admin</w:t>
-      </w:r>
-    </w:p>
-    <w:p>
-      <w:pPr>
-        <w:numPr>
-          <w:ilvl w:val="0"/>
-          <w:numId w:val="1069"/>
-        </w:numPr>
-        <w:pStyle w:val="Compact"/>
-      </w:pPr>
-      <w:r>
-        <w:rPr>
-          <w:bCs/>
-          <w:b/>
-        </w:rPr>
-        <w:t xml:space="preserve">Deskripsi</w:t>
-      </w:r>
-      <w:r>
-        <w:t xml:space="preserve">: Sistem</w:t>
-      </w:r>
-      <w:r>
-        <w:t xml:space="preserve"> </w:t>
-      </w:r>
-      <w:r>
-        <w:rPr>
-          <w:bCs/>
-          <w:b/>
-        </w:rPr>
-        <w:t xml:space="preserve">harus</w:t>
-      </w:r>
-      <w:r>
-        <w:t xml:space="preserve"> </w:t>
-      </w:r>
-      <w:r>
-        <w:t xml:space="preserve">memungkinkan pencatatan penyaluran item kepada pengguna (mahasiswa) dengan kuantitas per transaksi.</w:t>
-      </w:r>
-    </w:p>
-    <w:p>
-      <w:pPr>
-        <w:numPr>
-          <w:ilvl w:val="0"/>
-          <w:numId w:val="1069"/>
-        </w:numPr>
-        <w:pStyle w:val="Compact"/>
-      </w:pPr>
-      <w:r>
-        <w:rPr>
-          <w:bCs/>
-          <w:b/>
-        </w:rPr>
-        <w:t xml:space="preserve">Prioritas</w:t>
-      </w:r>
-      <w:r>
-        <w:t xml:space="preserve">: TINGGI</w:t>
-      </w:r>
-    </w:p>
-    <w:bookmarkEnd w:id="93"/>
-    <w:bookmarkStart w:id="94" w:name="fr-cons-004-transaksi-massal-bulk"/>
-    <w:p>
-      <w:pPr>
-        <w:pStyle w:val="Heading3"/>
-      </w:pPr>
-      <w:r>
-        <w:rPr>
-          <w:rStyle w:val="SectionNumber"/>
-        </w:rPr>
-        <w:t xml:space="preserve">3.10.4</w:t>
-      </w:r>
-      <w:r>
-        <w:tab/>
-      </w:r>
-      <w:r>
-        <w:t xml:space="preserve">FR-CONS-004 — Transaksi Massal (Bulk)</w:t>
-      </w:r>
-    </w:p>
-    <w:p>
-      <w:pPr>
-        <w:numPr>
-          <w:ilvl w:val="0"/>
-          <w:numId w:val="1070"/>
-        </w:numPr>
-        <w:pStyle w:val="Compact"/>
-      </w:pPr>
-      <w:r>
-        <w:rPr>
-          <w:bCs/>
-          <w:b/>
-        </w:rPr>
-        <w:t xml:space="preserve">Aktor</w:t>
-      </w:r>
-      <w:r>
-        <w:t xml:space="preserve">: Laboran, Kepala Lab, Super Admin</w:t>
-      </w:r>
-    </w:p>
-    <w:p>
-      <w:pPr>
-        <w:numPr>
-          <w:ilvl w:val="0"/>
-          <w:numId w:val="1070"/>
-        </w:numPr>
-        <w:pStyle w:val="Compact"/>
-      </w:pPr>
-      <w:r>
-        <w:rPr>
-          <w:bCs/>
-          <w:b/>
-        </w:rPr>
-        <w:t xml:space="preserve">Deskripsi</w:t>
-      </w:r>
-      <w:r>
-        <w:t xml:space="preserve">: Sistem</w:t>
-      </w:r>
-      <w:r>
-        <w:t xml:space="preserve"> </w:t>
-      </w:r>
-      <w:r>
-        <w:rPr>
-          <w:bCs/>
-          <w:b/>
-        </w:rPr>
-        <w:t xml:space="preserve">harus</w:t>
-      </w:r>
-      <w:r>
-        <w:t xml:space="preserve"> </w:t>
-      </w:r>
-      <w:r>
-        <w:t xml:space="preserve">memungkinkan pencatatan beberapa transaksi sekaligus untuk satu penerima.</w:t>
-      </w:r>
-    </w:p>
-    <w:p>
-      <w:pPr>
-        <w:numPr>
-          <w:ilvl w:val="0"/>
-          <w:numId w:val="1070"/>
-        </w:numPr>
-        <w:pStyle w:val="Compact"/>
-      </w:pPr>
-      <w:r>
-        <w:rPr>
-          <w:bCs/>
-          <w:b/>
-        </w:rPr>
-        <w:t xml:space="preserve">Prioritas</w:t>
-      </w:r>
-      <w:r>
-        <w:t xml:space="preserve">: SEDANG</w:t>
-      </w:r>
-    </w:p>
-    <w:bookmarkEnd w:id="94"/>
-    <w:bookmarkStart w:id="95" w:name="fr-cons-005-notifikasi-stok-rendah"/>
-    <w:p>
-      <w:pPr>
-        <w:pStyle w:val="Heading3"/>
-      </w:pPr>
-      <w:r>
-        <w:rPr>
-          <w:rStyle w:val="SectionNumber"/>
-        </w:rPr>
-        <w:t xml:space="preserve">3.10.5</w:t>
-      </w:r>
-      <w:r>
-        <w:tab/>
-      </w:r>
-      <w:r>
-        <w:t xml:space="preserve">FR-CONS-005 — Notifikasi Stok Rendah</w:t>
-      </w:r>
-    </w:p>
-    <w:p>
-      <w:pPr>
-        <w:numPr>
-          <w:ilvl w:val="0"/>
-          <w:numId w:val="1071"/>
-        </w:numPr>
-        <w:pStyle w:val="Compact"/>
-      </w:pPr>
-      <w:r>
-        <w:rPr>
-          <w:bCs/>
-          <w:b/>
-        </w:rPr>
-        <w:t xml:space="preserve">Aktor</w:t>
-      </w:r>
-      <w:r>
-        <w:t xml:space="preserve">: sistem (UI)</w:t>
-      </w:r>
-    </w:p>
-    <w:p>
-      <w:pPr>
-        <w:numPr>
-          <w:ilvl w:val="0"/>
-          <w:numId w:val="1071"/>
-        </w:numPr>
-        <w:pStyle w:val="Compact"/>
-      </w:pPr>
-      <w:r>
-        <w:rPr>
-          <w:bCs/>
-          <w:b/>
-        </w:rPr>
-        <w:t xml:space="preserve">Deskripsi</w:t>
-      </w:r>
-      <w:r>
-        <w:t xml:space="preserve">: Sistem</w:t>
-      </w:r>
-      <w:r>
-        <w:t xml:space="preserve"> </w:t>
-      </w:r>
-      <w:r>
-        <w:rPr>
-          <w:bCs/>
-          <w:b/>
-        </w:rPr>
-        <w:t xml:space="preserve">harus</w:t>
-      </w:r>
-      <w:r>
-        <w:t xml:space="preserve"> </w:t>
-      </w:r>
-      <w:r>
-        <w:t xml:space="preserve">menampilkan indikator visual untuk item dengan stok di bawah</w:t>
-      </w:r>
-      <w:r>
-        <w:t xml:space="preserve"> </w:t>
-      </w:r>
-      <w:r>
-        <w:rPr>
-          <w:rStyle w:val="VerbatimChar"/>
-        </w:rPr>
-        <w:t xml:space="preserve">minimumStock</w:t>
-      </w:r>
-      <w:r>
-        <w:t xml:space="preserve"> </w:t>
-      </w:r>
-      <w:r>
-        <w:t xml:space="preserve">pada daftar.</w:t>
-      </w:r>
-    </w:p>
-    <w:p>
-      <w:pPr>
-        <w:numPr>
-          <w:ilvl w:val="0"/>
-          <w:numId w:val="1071"/>
-        </w:numPr>
-        <w:pStyle w:val="Compact"/>
-      </w:pPr>
-      <w:r>
-        <w:rPr>
-          <w:bCs/>
-          <w:b/>
-        </w:rPr>
-        <w:t xml:space="preserve">Prioritas</w:t>
-      </w:r>
-      <w:r>
-        <w:t xml:space="preserve">: SEDANG</w:t>
-      </w:r>
-    </w:p>
-    <w:bookmarkEnd w:id="95"/>
-    <w:bookmarkStart w:id="96" w:name="fr-cons-006-riwayat-transaksi"/>
-    <w:p>
-      <w:pPr>
-        <w:pStyle w:val="Heading3"/>
-      </w:pPr>
-      <w:r>
-        <w:rPr>
-          <w:rStyle w:val="SectionNumber"/>
-        </w:rPr>
-        <w:t xml:space="preserve">3.10.6</w:t>
-      </w:r>
-      <w:r>
-        <w:tab/>
-      </w:r>
-      <w:r>
-        <w:t xml:space="preserve">FR-CONS-006 — Riwayat Transaksi</w:t>
-      </w:r>
-    </w:p>
-    <w:p>
-      <w:pPr>
-        <w:numPr>
-          <w:ilvl w:val="0"/>
-          <w:numId w:val="1072"/>
-        </w:numPr>
-        <w:pStyle w:val="Compact"/>
-      </w:pPr>
-      <w:r>
-        <w:rPr>
-          <w:bCs/>
-          <w:b/>
-        </w:rPr>
-        <w:t xml:space="preserve">Aktor</w:t>
-      </w:r>
-      <w:r>
-        <w:t xml:space="preserve">: Laboran, Kepala Lab, Super Admin</w:t>
-      </w:r>
-    </w:p>
-    <w:p>
-      <w:pPr>
-        <w:numPr>
-          <w:ilvl w:val="0"/>
-          <w:numId w:val="1072"/>
-        </w:numPr>
-        <w:pStyle w:val="Compact"/>
-      </w:pPr>
-      <w:r>
-        <w:rPr>
-          <w:bCs/>
-          <w:b/>
-        </w:rPr>
-        <w:t xml:space="preserve">Deskripsi</w:t>
-      </w:r>
-      <w:r>
-        <w:t xml:space="preserve">: Sistem</w:t>
-      </w:r>
-      <w:r>
-        <w:t xml:space="preserve"> </w:t>
-      </w:r>
-      <w:r>
-        <w:rPr>
-          <w:bCs/>
-          <w:b/>
-        </w:rPr>
-        <w:t xml:space="preserve">harus</w:t>
-      </w:r>
-      <w:r>
-        <w:t xml:space="preserve"> </w:t>
-      </w:r>
-      <w:r>
-        <w:t xml:space="preserve">menyediakan riwayat transaksi per item dan agregat lintas item dengan filter tanggal.</w:t>
-      </w:r>
-    </w:p>
-    <w:p>
-      <w:pPr>
-        <w:numPr>
-          <w:ilvl w:val="0"/>
-          <w:numId w:val="1072"/>
-        </w:numPr>
-        <w:pStyle w:val="Compact"/>
-      </w:pPr>
-      <w:r>
-        <w:rPr>
-          <w:bCs/>
-          <w:b/>
-        </w:rPr>
-        <w:t xml:space="preserve">Prioritas</w:t>
-      </w:r>
-      <w:r>
-        <w:t xml:space="preserve">: TINGGI</w:t>
       </w:r>
     </w:p>
     <w:bookmarkEnd w:id="96"/>
     <w:bookmarkEnd w:id="97"/>
-    <w:bookmarkStart w:id="100" w:name="modul-self-service-me"/>
+    <w:bookmarkStart w:id="104" w:name="modul-habis-pakai-cons"/>
     <w:p>
       <w:pPr>
         <w:pStyle w:val="Heading2"/>
@@ -9220,6 +9305,592 @@
         <w:rPr>
           <w:rStyle w:val="SectionNumber"/>
         </w:rPr>
+        <w:t xml:space="preserve">3.10</w:t>
+      </w:r>
+      <w:r>
+        <w:tab/>
+      </w:r>
+      <w:r>
+        <w:t xml:space="preserve">3.10 Modul Habis Pakai (CONS)</w:t>
+      </w:r>
+    </w:p>
+    <w:bookmarkStart w:id="98" w:name="fr-cons-001-pendaftaran-item"/>
+    <w:p>
+      <w:pPr>
+        <w:pStyle w:val="Heading3"/>
+      </w:pPr>
+      <w:r>
+        <w:rPr>
+          <w:rStyle w:val="SectionNumber"/>
+        </w:rPr>
+        <w:t xml:space="preserve">3.10.1</w:t>
+      </w:r>
+      <w:r>
+        <w:tab/>
+      </w:r>
+      <w:r>
+        <w:t xml:space="preserve">FR-CONS-001 — Pendaftaran Item</w:t>
+      </w:r>
+    </w:p>
+    <w:p>
+      <w:pPr>
+        <w:numPr>
+          <w:ilvl w:val="0"/>
+          <w:numId w:val="1067"/>
+        </w:numPr>
+        <w:pStyle w:val="Compact"/>
+      </w:pPr>
+      <w:r>
+        <w:rPr>
+          <w:bCs/>
+          <w:b/>
+        </w:rPr>
+        <w:t xml:space="preserve">Aktor</w:t>
+      </w:r>
+      <w:r>
+        <w:t xml:space="preserve">: Laboran, Kepala Lab, Super Admin</w:t>
+      </w:r>
+    </w:p>
+    <w:p>
+      <w:pPr>
+        <w:numPr>
+          <w:ilvl w:val="0"/>
+          <w:numId w:val="1067"/>
+        </w:numPr>
+        <w:pStyle w:val="Compact"/>
+      </w:pPr>
+      <w:r>
+        <w:rPr>
+          <w:bCs/>
+          <w:b/>
+        </w:rPr>
+        <w:t xml:space="preserve">Deskripsi</w:t>
+      </w:r>
+      <w:r>
+        <w:t xml:space="preserve">: Sistem</w:t>
+      </w:r>
+      <w:r>
+        <w:t xml:space="preserve"> </w:t>
+      </w:r>
+      <w:r>
+        <w:rPr>
+          <w:bCs/>
+          <w:b/>
+        </w:rPr>
+        <w:t xml:space="preserve">harus</w:t>
+      </w:r>
+      <w:r>
+        <w:t xml:space="preserve"> </w:t>
+      </w:r>
+      <w:r>
+        <w:t xml:space="preserve">memungkinkan pencatatan item habis pakai dengan satuan, stok, dan stok minimum.</w:t>
+      </w:r>
+    </w:p>
+    <w:p>
+      <w:pPr>
+        <w:numPr>
+          <w:ilvl w:val="0"/>
+          <w:numId w:val="1067"/>
+        </w:numPr>
+        <w:pStyle w:val="Compact"/>
+      </w:pPr>
+      <w:r>
+        <w:rPr>
+          <w:bCs/>
+          <w:b/>
+        </w:rPr>
+        <w:t xml:space="preserve">Prioritas</w:t>
+      </w:r>
+      <w:r>
+        <w:t xml:space="preserve">: TINGGI</w:t>
+      </w:r>
+    </w:p>
+    <w:bookmarkEnd w:id="98"/>
+    <w:bookmarkStart w:id="99" w:name="fr-cons-002-transaksi-penambahan-stok-in"/>
+    <w:p>
+      <w:pPr>
+        <w:pStyle w:val="Heading3"/>
+      </w:pPr>
+      <w:r>
+        <w:rPr>
+          <w:rStyle w:val="SectionNumber"/>
+        </w:rPr>
+        <w:t xml:space="preserve">3.10.2</w:t>
+      </w:r>
+      <w:r>
+        <w:tab/>
+      </w:r>
+      <w:r>
+        <w:t xml:space="preserve">FR-CONS-002 — Transaksi Penambahan Stok (IN)</w:t>
+      </w:r>
+    </w:p>
+    <w:p>
+      <w:pPr>
+        <w:numPr>
+          <w:ilvl w:val="0"/>
+          <w:numId w:val="1068"/>
+        </w:numPr>
+        <w:pStyle w:val="Compact"/>
+      </w:pPr>
+      <w:r>
+        <w:rPr>
+          <w:bCs/>
+          <w:b/>
+        </w:rPr>
+        <w:t xml:space="preserve">Aktor</w:t>
+      </w:r>
+      <w:r>
+        <w:t xml:space="preserve">: Laboran, Kepala Lab, Super Admin</w:t>
+      </w:r>
+    </w:p>
+    <w:p>
+      <w:pPr>
+        <w:numPr>
+          <w:ilvl w:val="0"/>
+          <w:numId w:val="1068"/>
+        </w:numPr>
+        <w:pStyle w:val="Compact"/>
+      </w:pPr>
+      <w:r>
+        <w:rPr>
+          <w:bCs/>
+          <w:b/>
+        </w:rPr>
+        <w:t xml:space="preserve">Deskripsi</w:t>
+      </w:r>
+      <w:r>
+        <w:t xml:space="preserve">: Sistem</w:t>
+      </w:r>
+      <w:r>
+        <w:t xml:space="preserve"> </w:t>
+      </w:r>
+      <w:r>
+        <w:rPr>
+          <w:bCs/>
+          <w:b/>
+        </w:rPr>
+        <w:t xml:space="preserve">harus</w:t>
+      </w:r>
+      <w:r>
+        <w:t xml:space="preserve"> </w:t>
+      </w:r>
+      <w:r>
+        <w:t xml:space="preserve">memungkinkan pencatatan transaksi penambahan stok dengan catatan opsional.</w:t>
+      </w:r>
+    </w:p>
+    <w:p>
+      <w:pPr>
+        <w:numPr>
+          <w:ilvl w:val="0"/>
+          <w:numId w:val="1068"/>
+        </w:numPr>
+        <w:pStyle w:val="Compact"/>
+      </w:pPr>
+      <w:r>
+        <w:rPr>
+          <w:bCs/>
+          <w:b/>
+        </w:rPr>
+        <w:t xml:space="preserve">Prioritas</w:t>
+      </w:r>
+      <w:r>
+        <w:t xml:space="preserve">: TINGGI</w:t>
+      </w:r>
+    </w:p>
+    <w:bookmarkEnd w:id="99"/>
+    <w:bookmarkStart w:id="100" w:name="fr-cons-003-transaksi-penyaluran-out"/>
+    <w:p>
+      <w:pPr>
+        <w:pStyle w:val="Heading3"/>
+      </w:pPr>
+      <w:r>
+        <w:rPr>
+          <w:rStyle w:val="SectionNumber"/>
+        </w:rPr>
+        <w:t xml:space="preserve">3.10.3</w:t>
+      </w:r>
+      <w:r>
+        <w:tab/>
+      </w:r>
+      <w:r>
+        <w:t xml:space="preserve">FR-CONS-003 — Transaksi Penyaluran (OUT)</w:t>
+      </w:r>
+    </w:p>
+    <w:p>
+      <w:pPr>
+        <w:numPr>
+          <w:ilvl w:val="0"/>
+          <w:numId w:val="1069"/>
+        </w:numPr>
+        <w:pStyle w:val="Compact"/>
+      </w:pPr>
+      <w:r>
+        <w:rPr>
+          <w:bCs/>
+          <w:b/>
+        </w:rPr>
+        <w:t xml:space="preserve">Aktor</w:t>
+      </w:r>
+      <w:r>
+        <w:t xml:space="preserve">: Laboran, Kepala Lab, Super Admin</w:t>
+      </w:r>
+    </w:p>
+    <w:p>
+      <w:pPr>
+        <w:numPr>
+          <w:ilvl w:val="0"/>
+          <w:numId w:val="1069"/>
+        </w:numPr>
+        <w:pStyle w:val="Compact"/>
+      </w:pPr>
+      <w:r>
+        <w:rPr>
+          <w:bCs/>
+          <w:b/>
+        </w:rPr>
+        <w:t xml:space="preserve">Deskripsi</w:t>
+      </w:r>
+      <w:r>
+        <w:t xml:space="preserve">: Sistem</w:t>
+      </w:r>
+      <w:r>
+        <w:t xml:space="preserve"> </w:t>
+      </w:r>
+      <w:r>
+        <w:rPr>
+          <w:bCs/>
+          <w:b/>
+        </w:rPr>
+        <w:t xml:space="preserve">harus</w:t>
+      </w:r>
+      <w:r>
+        <w:t xml:space="preserve"> </w:t>
+      </w:r>
+      <w:r>
+        <w:t xml:space="preserve">memungkinkan pencatatan penyaluran item kepada pengguna (mahasiswa) dengan kuantitas per transaksi.</w:t>
+      </w:r>
+    </w:p>
+    <w:p>
+      <w:pPr>
+        <w:numPr>
+          <w:ilvl w:val="0"/>
+          <w:numId w:val="1069"/>
+        </w:numPr>
+        <w:pStyle w:val="Compact"/>
+      </w:pPr>
+      <w:r>
+        <w:rPr>
+          <w:bCs/>
+          <w:b/>
+        </w:rPr>
+        <w:t xml:space="preserve">Prioritas</w:t>
+      </w:r>
+      <w:r>
+        <w:t xml:space="preserve">: TINGGI</w:t>
+      </w:r>
+    </w:p>
+    <w:bookmarkEnd w:id="100"/>
+    <w:bookmarkStart w:id="101" w:name="fr-cons-004-transaksi-massal-bulk"/>
+    <w:p>
+      <w:pPr>
+        <w:pStyle w:val="Heading3"/>
+      </w:pPr>
+      <w:r>
+        <w:rPr>
+          <w:rStyle w:val="SectionNumber"/>
+        </w:rPr>
+        <w:t xml:space="preserve">3.10.4</w:t>
+      </w:r>
+      <w:r>
+        <w:tab/>
+      </w:r>
+      <w:r>
+        <w:t xml:space="preserve">FR-CONS-004 — Transaksi Massal (Bulk)</w:t>
+      </w:r>
+    </w:p>
+    <w:p>
+      <w:pPr>
+        <w:numPr>
+          <w:ilvl w:val="0"/>
+          <w:numId w:val="1070"/>
+        </w:numPr>
+        <w:pStyle w:val="Compact"/>
+      </w:pPr>
+      <w:r>
+        <w:rPr>
+          <w:bCs/>
+          <w:b/>
+        </w:rPr>
+        <w:t xml:space="preserve">Aktor</w:t>
+      </w:r>
+      <w:r>
+        <w:t xml:space="preserve">: Laboran, Kepala Lab, Super Admin</w:t>
+      </w:r>
+    </w:p>
+    <w:p>
+      <w:pPr>
+        <w:numPr>
+          <w:ilvl w:val="0"/>
+          <w:numId w:val="1070"/>
+        </w:numPr>
+        <w:pStyle w:val="Compact"/>
+      </w:pPr>
+      <w:r>
+        <w:rPr>
+          <w:bCs/>
+          <w:b/>
+        </w:rPr>
+        <w:t xml:space="preserve">Deskripsi</w:t>
+      </w:r>
+      <w:r>
+        <w:t xml:space="preserve">: Sistem</w:t>
+      </w:r>
+      <w:r>
+        <w:t xml:space="preserve"> </w:t>
+      </w:r>
+      <w:r>
+        <w:rPr>
+          <w:bCs/>
+          <w:b/>
+        </w:rPr>
+        <w:t xml:space="preserve">harus</w:t>
+      </w:r>
+      <w:r>
+        <w:t xml:space="preserve"> </w:t>
+      </w:r>
+      <w:r>
+        <w:t xml:space="preserve">memungkinkan pencatatan beberapa transaksi sekaligus untuk satu penerima.</w:t>
+      </w:r>
+    </w:p>
+    <w:p>
+      <w:pPr>
+        <w:numPr>
+          <w:ilvl w:val="0"/>
+          <w:numId w:val="1070"/>
+        </w:numPr>
+        <w:pStyle w:val="Compact"/>
+      </w:pPr>
+      <w:r>
+        <w:rPr>
+          <w:bCs/>
+          <w:b/>
+        </w:rPr>
+        <w:t xml:space="preserve">Prioritas</w:t>
+      </w:r>
+      <w:r>
+        <w:t xml:space="preserve">: SEDANG</w:t>
+      </w:r>
+    </w:p>
+    <w:bookmarkEnd w:id="101"/>
+    <w:bookmarkStart w:id="102" w:name="fr-cons-005-notifikasi-stok-rendah"/>
+    <w:p>
+      <w:pPr>
+        <w:pStyle w:val="Heading3"/>
+      </w:pPr>
+      <w:r>
+        <w:rPr>
+          <w:rStyle w:val="SectionNumber"/>
+        </w:rPr>
+        <w:t xml:space="preserve">3.10.5</w:t>
+      </w:r>
+      <w:r>
+        <w:tab/>
+      </w:r>
+      <w:r>
+        <w:t xml:space="preserve">FR-CONS-005 — Notifikasi Stok Rendah</w:t>
+      </w:r>
+    </w:p>
+    <w:p>
+      <w:pPr>
+        <w:numPr>
+          <w:ilvl w:val="0"/>
+          <w:numId w:val="1071"/>
+        </w:numPr>
+        <w:pStyle w:val="Compact"/>
+      </w:pPr>
+      <w:r>
+        <w:rPr>
+          <w:bCs/>
+          <w:b/>
+        </w:rPr>
+        <w:t xml:space="preserve">Aktor</w:t>
+      </w:r>
+      <w:r>
+        <w:t xml:space="preserve">: sistem (UI)</w:t>
+      </w:r>
+    </w:p>
+    <w:p>
+      <w:pPr>
+        <w:numPr>
+          <w:ilvl w:val="0"/>
+          <w:numId w:val="1071"/>
+        </w:numPr>
+        <w:pStyle w:val="Compact"/>
+      </w:pPr>
+      <w:r>
+        <w:rPr>
+          <w:bCs/>
+          <w:b/>
+        </w:rPr>
+        <w:t xml:space="preserve">Deskripsi</w:t>
+      </w:r>
+      <w:r>
+        <w:t xml:space="preserve">: Sistem</w:t>
+      </w:r>
+      <w:r>
+        <w:t xml:space="preserve"> </w:t>
+      </w:r>
+      <w:r>
+        <w:rPr>
+          <w:bCs/>
+          <w:b/>
+        </w:rPr>
+        <w:t xml:space="preserve">harus</w:t>
+      </w:r>
+      <w:r>
+        <w:t xml:space="preserve"> </w:t>
+      </w:r>
+      <w:r>
+        <w:t xml:space="preserve">menampilkan indikator visual untuk item dengan stok di bawah</w:t>
+      </w:r>
+      <w:r>
+        <w:t xml:space="preserve"> </w:t>
+      </w:r>
+      <w:r>
+        <w:rPr>
+          <w:rStyle w:val="VerbatimChar"/>
+        </w:rPr>
+        <w:t xml:space="preserve">minimumStock</w:t>
+      </w:r>
+      <w:r>
+        <w:t xml:space="preserve"> </w:t>
+      </w:r>
+      <w:r>
+        <w:t xml:space="preserve">pada daftar.</w:t>
+      </w:r>
+    </w:p>
+    <w:p>
+      <w:pPr>
+        <w:numPr>
+          <w:ilvl w:val="0"/>
+          <w:numId w:val="1071"/>
+        </w:numPr>
+        <w:pStyle w:val="Compact"/>
+      </w:pPr>
+      <w:r>
+        <w:rPr>
+          <w:bCs/>
+          <w:b/>
+        </w:rPr>
+        <w:t xml:space="preserve">Prioritas</w:t>
+      </w:r>
+      <w:r>
+        <w:t xml:space="preserve">: SEDANG</w:t>
+      </w:r>
+    </w:p>
+    <w:bookmarkEnd w:id="102"/>
+    <w:bookmarkStart w:id="103" w:name="fr-cons-006-riwayat-transaksi"/>
+    <w:p>
+      <w:pPr>
+        <w:pStyle w:val="Heading3"/>
+      </w:pPr>
+      <w:r>
+        <w:rPr>
+          <w:rStyle w:val="SectionNumber"/>
+        </w:rPr>
+        <w:t xml:space="preserve">3.10.6</w:t>
+      </w:r>
+      <w:r>
+        <w:tab/>
+      </w:r>
+      <w:r>
+        <w:t xml:space="preserve">FR-CONS-006 — Riwayat Transaksi</w:t>
+      </w:r>
+    </w:p>
+    <w:p>
+      <w:pPr>
+        <w:numPr>
+          <w:ilvl w:val="0"/>
+          <w:numId w:val="1072"/>
+        </w:numPr>
+        <w:pStyle w:val="Compact"/>
+      </w:pPr>
+      <w:r>
+        <w:rPr>
+          <w:bCs/>
+          <w:b/>
+        </w:rPr>
+        <w:t xml:space="preserve">Aktor</w:t>
+      </w:r>
+      <w:r>
+        <w:t xml:space="preserve">: Laboran, Kepala Lab, Super Admin</w:t>
+      </w:r>
+    </w:p>
+    <w:p>
+      <w:pPr>
+        <w:numPr>
+          <w:ilvl w:val="0"/>
+          <w:numId w:val="1072"/>
+        </w:numPr>
+        <w:pStyle w:val="Compact"/>
+      </w:pPr>
+      <w:r>
+        <w:rPr>
+          <w:bCs/>
+          <w:b/>
+        </w:rPr>
+        <w:t xml:space="preserve">Deskripsi</w:t>
+      </w:r>
+      <w:r>
+        <w:t xml:space="preserve">: Sistem</w:t>
+      </w:r>
+      <w:r>
+        <w:t xml:space="preserve"> </w:t>
+      </w:r>
+      <w:r>
+        <w:rPr>
+          <w:bCs/>
+          <w:b/>
+        </w:rPr>
+        <w:t xml:space="preserve">harus</w:t>
+      </w:r>
+      <w:r>
+        <w:t xml:space="preserve"> </w:t>
+      </w:r>
+      <w:r>
+        <w:t xml:space="preserve">menyediakan riwayat transaksi per item dan agregat lintas item dengan filter tanggal.</w:t>
+      </w:r>
+    </w:p>
+    <w:p>
+      <w:pPr>
+        <w:numPr>
+          <w:ilvl w:val="0"/>
+          <w:numId w:val="1072"/>
+        </w:numPr>
+        <w:pStyle w:val="Compact"/>
+      </w:pPr>
+      <w:r>
+        <w:rPr>
+          <w:bCs/>
+          <w:b/>
+        </w:rPr>
+        <w:t xml:space="preserve">Prioritas</w:t>
+      </w:r>
+      <w:r>
+        <w:t xml:space="preserve">: TINGGI</w:t>
+      </w:r>
+    </w:p>
+    <w:bookmarkEnd w:id="103"/>
+    <w:bookmarkEnd w:id="104"/>
+    <w:bookmarkStart w:id="107" w:name="modul-self-service-me"/>
+    <w:p>
+      <w:pPr>
+        <w:pStyle w:val="Heading2"/>
+      </w:pPr>
+      <w:r>
+        <w:rPr>
+          <w:rStyle w:val="SectionNumber"/>
+        </w:rPr>
         <w:t xml:space="preserve">3.11</w:t>
       </w:r>
       <w:r>
@@ -9229,7 +9900,7 @@
         <w:t xml:space="preserve">3.11 Modul Self-Service (ME)</w:t>
       </w:r>
     </w:p>
-    <w:bookmarkStart w:id="98" w:name="fr-me-001-daftar-item-aktif-pengguna"/>
+    <w:bookmarkStart w:id="105" w:name="fr-me-001-daftar-item-aktif-pengguna"/>
     <w:p>
       <w:pPr>
         <w:pStyle w:val="Heading3"/>
@@ -9320,8 +9991,8 @@
         <w:t xml:space="preserve">: TINGGI</w:t>
       </w:r>
     </w:p>
-    <w:bookmarkEnd w:id="98"/>
-    <w:bookmarkStart w:id="99" w:name="Xbc170e23a08346dfb39716e60659c11d114f5bc"/>
+    <w:bookmarkEnd w:id="105"/>
+    <w:bookmarkStart w:id="106" w:name="Xbc170e23a08346dfb39716e60659c11d114f5bc"/>
     <w:p>
       <w:pPr>
         <w:pStyle w:val="Heading3"/>
@@ -9412,9 +10083,9 @@
         <w:t xml:space="preserve">: TINGGI</w:t>
       </w:r>
     </w:p>
-    <w:bookmarkEnd w:id="99"/>
-    <w:bookmarkEnd w:id="100"/>
-    <w:bookmarkStart w:id="104" w:name="modul-riwayat-audit-hist"/>
+    <w:bookmarkEnd w:id="106"/>
+    <w:bookmarkEnd w:id="107"/>
+    <w:bookmarkStart w:id="111" w:name="modul-riwayat-audit-hist"/>
     <w:p>
       <w:pPr>
         <w:pStyle w:val="Heading2"/>
@@ -9432,7 +10103,7 @@
         <w:t xml:space="preserve">3.12 Modul Riwayat &amp; Audit (HIST)</w:t>
       </w:r>
     </w:p>
-    <w:bookmarkStart w:id="101" w:name="fr-hist-001-riwayat-lintas-modul"/>
+    <w:bookmarkStart w:id="108" w:name="fr-hist-001-riwayat-lintas-modul"/>
     <w:p>
       <w:pPr>
         <w:pStyle w:val="Heading3"/>
@@ -9539,8 +10210,8 @@
         <w:t xml:space="preserve">: TINGGI</w:t>
       </w:r>
     </w:p>
-    <w:bookmarkEnd w:id="101"/>
-    <w:bookmarkStart w:id="102" w:name="fr-hist-002-timeline-per-transaksi"/>
+    <w:bookmarkEnd w:id="108"/>
+    <w:bookmarkStart w:id="109" w:name="fr-hist-002-timeline-per-transaksi"/>
     <w:p>
       <w:pPr>
         <w:pStyle w:val="Heading3"/>
@@ -9647,8 +10318,8 @@
         <w:t xml:space="preserve">: SEDANG</w:t>
       </w:r>
     </w:p>
-    <w:bookmarkEnd w:id="102"/>
-    <w:bookmarkStart w:id="103" w:name="Xa927dd51394da438305829ac16104a4f6a2fed9"/>
+    <w:bookmarkEnd w:id="109"/>
+    <w:bookmarkStart w:id="110" w:name="Xa927dd51394da438305829ac16104a4f6a2fed9"/>
     <w:p>
       <w:pPr>
         <w:pStyle w:val="Heading3"/>
@@ -9751,9 +10422,9 @@
         <w:t xml:space="preserve">: TINGGI</w:t>
       </w:r>
     </w:p>
-    <w:bookmarkEnd w:id="103"/>
-    <w:bookmarkEnd w:id="104"/>
-    <w:bookmarkStart w:id="109" w:name="modul-petunjuk-guide"/>
+    <w:bookmarkEnd w:id="110"/>
+    <w:bookmarkEnd w:id="111"/>
+    <w:bookmarkStart w:id="116" w:name="modul-petunjuk-guide"/>
     <w:p>
       <w:pPr>
         <w:pStyle w:val="Heading2"/>
@@ -9771,7 +10442,7 @@
         <w:t xml:space="preserve">3.13 Modul Petunjuk (GUIDE)</w:t>
       </w:r>
     </w:p>
-    <w:bookmarkStart w:id="105" w:name="X014229f87369864a82f7026b8f873deced6e840"/>
+    <w:bookmarkStart w:id="112" w:name="X014229f87369864a82f7026b8f873deced6e840"/>
     <w:p>
       <w:pPr>
         <w:pStyle w:val="Heading3"/>
@@ -9862,8 +10533,8 @@
         <w:t xml:space="preserve">: TINGGI</w:t>
       </w:r>
     </w:p>
-    <w:bookmarkEnd w:id="105"/>
-    <w:bookmarkStart w:id="106" w:name="X9409bd8c34820a5b1c12999f3c3bbd1ac807378"/>
+    <w:bookmarkEnd w:id="112"/>
+    <w:bookmarkStart w:id="113" w:name="X9409bd8c34820a5b1c12999f3c3bbd1ac807378"/>
     <w:p>
       <w:pPr>
         <w:pStyle w:val="Heading3"/>
@@ -9954,8 +10625,8 @@
         <w:t xml:space="preserve">: TINGGI</w:t>
       </w:r>
     </w:p>
-    <w:bookmarkEnd w:id="106"/>
-    <w:bookmarkStart w:id="107" w:name="fr-guide-003-riwayat-revisi"/>
+    <w:bookmarkEnd w:id="113"/>
+    <w:bookmarkStart w:id="114" w:name="fr-guide-003-riwayat-revisi"/>
     <w:p>
       <w:pPr>
         <w:pStyle w:val="Heading3"/>
@@ -10059,8 +10730,8 @@
         <w:t xml:space="preserve">: SEDANG</w:t>
       </w:r>
     </w:p>
-    <w:bookmarkEnd w:id="107"/>
-    <w:bookmarkStart w:id="108" w:name="fr-guide-004-unggah-gambar-pendukung"/>
+    <w:bookmarkEnd w:id="114"/>
+    <w:bookmarkStart w:id="115" w:name="fr-guide-004-unggah-gambar-pendukung"/>
     <w:p>
       <w:pPr>
         <w:pStyle w:val="Heading3"/>
@@ -10151,9 +10822,9 @@
         <w:t xml:space="preserve">: SEDANG</w:t>
       </w:r>
     </w:p>
-    <w:bookmarkEnd w:id="108"/>
-    <w:bookmarkEnd w:id="109"/>
-    <w:bookmarkStart w:id="114" w:name="modul-notifikasi-notif"/>
+    <w:bookmarkEnd w:id="115"/>
+    <w:bookmarkEnd w:id="116"/>
+    <w:bookmarkStart w:id="121" w:name="modul-notifikasi-notif"/>
     <w:p>
       <w:pPr>
         <w:pStyle w:val="Heading2"/>
@@ -10171,7 +10842,7 @@
         <w:t xml:space="preserve">3.14 Modul Notifikasi (NOTIF)</w:t>
       </w:r>
     </w:p>
-    <w:bookmarkStart w:id="110" w:name="fr-notif-001-notifikasi-multi-saluran"/>
+    <w:bookmarkStart w:id="117" w:name="fr-notif-001-notifikasi-multi-saluran"/>
     <w:p>
       <w:pPr>
         <w:pStyle w:val="Heading3"/>
@@ -10278,8 +10949,8 @@
         <w:t xml:space="preserve">: TINGGI</w:t>
       </w:r>
     </w:p>
-    <w:bookmarkEnd w:id="110"/>
-    <w:bookmarkStart w:id="111" w:name="fr-notif-002-toleransi-galat-saluran-wa"/>
+    <w:bookmarkEnd w:id="117"/>
+    <w:bookmarkStart w:id="118" w:name="fr-notif-002-toleransi-galat-saluran-wa"/>
     <w:p>
       <w:pPr>
         <w:pStyle w:val="Heading3"/>
@@ -10417,8 +11088,8 @@
         <w:t xml:space="preserve">.</w:t>
       </w:r>
     </w:p>
-    <w:bookmarkEnd w:id="111"/>
-    <w:bookmarkStart w:id="112" w:name="fr-notif-003-pengingat-otomatis"/>
+    <w:bookmarkEnd w:id="118"/>
+    <w:bookmarkStart w:id="119" w:name="fr-notif-003-pengingat-otomatis"/>
     <w:p>
       <w:pPr>
         <w:pStyle w:val="Heading3"/>
@@ -10509,8 +11180,8 @@
         <w:t xml:space="preserve">: TINGGI</w:t>
       </w:r>
     </w:p>
-    <w:bookmarkEnd w:id="112"/>
-    <w:bookmarkStart w:id="113" w:name="Xcce80ec316b07d9b7745bd3f378f61aa15f0d1c"/>
+    <w:bookmarkEnd w:id="119"/>
+    <w:bookmarkStart w:id="120" w:name="Xcce80ec316b07d9b7745bd3f378f61aa15f0d1c"/>
     <w:p>
       <w:pPr>
         <w:pStyle w:val="Heading3"/>
@@ -10617,9 +11288,9 @@
         <w:t xml:space="preserve">: TINGGI</w:t>
       </w:r>
     </w:p>
-    <w:bookmarkEnd w:id="113"/>
-    <w:bookmarkEnd w:id="114"/>
-    <w:bookmarkStart w:id="117" w:name="modul-verifikasi-publik-verify"/>
+    <w:bookmarkEnd w:id="120"/>
+    <w:bookmarkEnd w:id="121"/>
+    <w:bookmarkStart w:id="124" w:name="modul-verifikasi-publik-verify"/>
     <w:p>
       <w:pPr>
         <w:pStyle w:val="Heading2"/>
@@ -10637,7 +11308,7 @@
         <w:t xml:space="preserve">3.15 Modul Verifikasi Publik (VERIFY)</w:t>
       </w:r>
     </w:p>
-    <w:bookmarkStart w:id="115" w:name="X4badfb290ff554c248282a5e2ec7e830f863896"/>
+    <w:bookmarkStart w:id="122" w:name="X4badfb290ff554c248282a5e2ec7e830f863896"/>
     <w:p>
       <w:pPr>
         <w:pStyle w:val="Heading3"/>
@@ -10744,8 +11415,8 @@
         <w:t xml:space="preserve">: TINGGI</w:t>
       </w:r>
     </w:p>
-    <w:bookmarkEnd w:id="115"/>
-    <w:bookmarkStart w:id="116" w:name="Xfdeace0251677639e34ffd0d0db47caf99e6808"/>
+    <w:bookmarkEnd w:id="122"/>
+    <w:bookmarkStart w:id="123" w:name="Xfdeace0251677639e34ffd0d0db47caf99e6808"/>
     <w:p>
       <w:pPr>
         <w:pStyle w:val="Heading3"/>
@@ -10836,9 +11507,9 @@
         <w:t xml:space="preserve">: TINGGI</w:t>
       </w:r>
     </w:p>
-    <w:bookmarkEnd w:id="116"/>
-    <w:bookmarkEnd w:id="117"/>
-    <w:bookmarkStart w:id="120" w:name="modul-konfigurasi-config"/>
+    <w:bookmarkEnd w:id="123"/>
+    <w:bookmarkEnd w:id="124"/>
+    <w:bookmarkStart w:id="127" w:name="modul-konfigurasi-config"/>
     <w:p>
       <w:pPr>
         <w:pStyle w:val="Heading2"/>
@@ -10856,7 +11527,7 @@
         <w:t xml:space="preserve">3.16 Modul Konfigurasi (CONFIG)</w:t>
       </w:r>
     </w:p>
-    <w:bookmarkStart w:id="118" w:name="fr-config-001-pengaturan-denda"/>
+    <w:bookmarkStart w:id="125" w:name="fr-config-001-pengaturan-denda"/>
     <w:p>
       <w:pPr>
         <w:pStyle w:val="Heading3"/>
@@ -10947,8 +11618,8 @@
         <w:t xml:space="preserve">: TINGGI</w:t>
       </w:r>
     </w:p>
-    <w:bookmarkEnd w:id="118"/>
-    <w:bookmarkStart w:id="119" w:name="fr-config-002-pengaturan-tanpa-restart"/>
+    <w:bookmarkEnd w:id="125"/>
+    <w:bookmarkStart w:id="126" w:name="fr-config-002-pengaturan-tanpa-restart"/>
     <w:p>
       <w:pPr>
         <w:pStyle w:val="Heading3"/>
@@ -11055,10 +11726,10 @@
         <w:t xml:space="preserve">: SEDANG</w:t>
       </w:r>
     </w:p>
-    <w:bookmarkEnd w:id="119"/>
-    <w:bookmarkEnd w:id="120"/>
-    <w:bookmarkEnd w:id="121"/>
-    <w:bookmarkStart w:id="157" w:name="persyaratan-non-fungsional"/>
+    <w:bookmarkEnd w:id="126"/>
+    <w:bookmarkEnd w:id="127"/>
+    <w:bookmarkEnd w:id="128"/>
+    <w:bookmarkStart w:id="164" w:name="persyaratan-non-fungsional"/>
     <w:p>
       <w:pPr>
         <w:pStyle w:val="Heading1"/>
@@ -11076,7 +11747,7 @@
         <w:t xml:space="preserve">4. Persyaratan Non-Fungsional</w:t>
       </w:r>
     </w:p>
-    <w:bookmarkStart w:id="122" w:name="konvensi-penomoran-1"/>
+    <w:bookmarkStart w:id="129" w:name="konvensi-penomoran-1"/>
     <w:p>
       <w:pPr>
         <w:pStyle w:val="Heading2"/>
@@ -11105,8 +11776,8 @@
         <w:t xml:space="preserve">NFR-&lt;KATEGORI&gt;-&lt;NOMOR&gt;     Contoh: NFR-SEC-001</w:t>
       </w:r>
     </w:p>
-    <w:bookmarkEnd w:id="122"/>
-    <w:bookmarkStart w:id="126" w:name="performa-perf"/>
+    <w:bookmarkEnd w:id="129"/>
+    <w:bookmarkStart w:id="133" w:name="performa-perf"/>
     <w:p>
       <w:pPr>
         <w:pStyle w:val="Heading2"/>
@@ -11124,7 +11795,7 @@
         <w:t xml:space="preserve">4.2 Performa (PERF)</w:t>
       </w:r>
     </w:p>
-    <w:bookmarkStart w:id="123" w:name="nfr-perf-001-waktu-respons-halaman-utama"/>
+    <w:bookmarkStart w:id="130" w:name="nfr-perf-001-waktu-respons-halaman-utama"/>
     <w:p>
       <w:pPr>
         <w:pStyle w:val="Heading3"/>
@@ -11196,8 +11867,8 @@
         <w:t xml:space="preserve">: SEDANG</w:t>
       </w:r>
     </w:p>
-    <w:bookmarkEnd w:id="123"/>
-    <w:bookmarkStart w:id="124" w:name="nfr-perf-002-waktu-respons-api"/>
+    <w:bookmarkEnd w:id="130"/>
+    <w:bookmarkStart w:id="131" w:name="nfr-perf-002-waktu-respons-api"/>
     <w:p>
       <w:pPr>
         <w:pStyle w:val="Heading3"/>
@@ -11285,8 +11956,8 @@
         <w:t xml:space="preserve">: SEDANG</w:t>
       </w:r>
     </w:p>
-    <w:bookmarkEnd w:id="124"/>
-    <w:bookmarkStart w:id="125" w:name="nfr-perf-003-pengiriman-notifikasi"/>
+    <w:bookmarkEnd w:id="131"/>
+    <w:bookmarkStart w:id="132" w:name="nfr-perf-003-pengiriman-notifikasi"/>
     <w:p>
       <w:pPr>
         <w:pStyle w:val="Heading3"/>
@@ -11358,9 +12029,9 @@
         <w:t xml:space="preserve">: SEDANG</w:t>
       </w:r>
     </w:p>
-    <w:bookmarkEnd w:id="125"/>
-    <w:bookmarkEnd w:id="126"/>
-    <w:bookmarkStart w:id="134" w:name="keamanan-sec"/>
+    <w:bookmarkEnd w:id="132"/>
+    <w:bookmarkEnd w:id="133"/>
+    <w:bookmarkStart w:id="141" w:name="keamanan-sec"/>
     <w:p>
       <w:pPr>
         <w:pStyle w:val="Heading2"/>
@@ -11378,7 +12049,7 @@
         <w:t xml:space="preserve">4.3 Keamanan (SEC)</w:t>
       </w:r>
     </w:p>
-    <w:bookmarkStart w:id="127" w:name="nfr-sec-001-enkripsi-lalu-lintas"/>
+    <w:bookmarkStart w:id="134" w:name="nfr-sec-001-enkripsi-lalu-lintas"/>
     <w:p>
       <w:pPr>
         <w:pStyle w:val="Heading3"/>
@@ -11466,8 +12137,8 @@
         <w:t xml:space="preserve">: TINGGI</w:t>
       </w:r>
     </w:p>
-    <w:bookmarkEnd w:id="127"/>
-    <w:bookmarkStart w:id="128" w:name="nfr-sec-002-otorisasi-sisi-server"/>
+    <w:bookmarkEnd w:id="134"/>
+    <w:bookmarkStart w:id="135" w:name="nfr-sec-002-otorisasi-sisi-server"/>
     <w:p>
       <w:pPr>
         <w:pStyle w:val="Heading3"/>
@@ -11587,8 +12258,8 @@
         <w:t xml:space="preserve">: TINGGI</w:t>
       </w:r>
     </w:p>
-    <w:bookmarkEnd w:id="128"/>
-    <w:bookmarkStart w:id="129" w:name="nfr-sec-003-validasi-input"/>
+    <w:bookmarkEnd w:id="135"/>
+    <w:bookmarkStart w:id="136" w:name="nfr-sec-003-validasi-input"/>
     <w:p>
       <w:pPr>
         <w:pStyle w:val="Heading3"/>
@@ -11715,8 +12386,8 @@
         <w:t xml:space="preserve">: TINGGI</w:t>
       </w:r>
     </w:p>
-    <w:bookmarkEnd w:id="129"/>
-    <w:bookmarkStart w:id="130" w:name="nfr-sec-004-pencegahan-path-traversal"/>
+    <w:bookmarkEnd w:id="136"/>
+    <w:bookmarkStart w:id="137" w:name="nfr-sec-004-pencegahan-path-traversal"/>
     <w:p>
       <w:pPr>
         <w:pStyle w:val="Heading3"/>
@@ -11850,8 +12521,8 @@
         <w:t xml:space="preserve">: TINGGI</w:t>
       </w:r>
     </w:p>
-    <w:bookmarkEnd w:id="130"/>
-    <w:bookmarkStart w:id="131" w:name="nfr-sec-005-pengelolaan-atribut-sensitif"/>
+    <w:bookmarkEnd w:id="137"/>
+    <w:bookmarkStart w:id="138" w:name="nfr-sec-005-pengelolaan-atribut-sensitif"/>
     <w:p>
       <w:pPr>
         <w:pStyle w:val="Heading3"/>
@@ -11955,8 +12626,8 @@
         <w:t xml:space="preserve">: TINGGI</w:t>
       </w:r>
     </w:p>
-    <w:bookmarkEnd w:id="131"/>
-    <w:bookmarkStart w:id="132" w:name="nfr-sec-006-sanitasi-konten-pengguna"/>
+    <w:bookmarkEnd w:id="138"/>
+    <w:bookmarkStart w:id="139" w:name="nfr-sec-006-sanitasi-konten-pengguna"/>
     <w:p>
       <w:pPr>
         <w:pStyle w:val="Heading3"/>
@@ -12044,8 +12715,8 @@
         <w:t xml:space="preserve">: TINGGI</w:t>
       </w:r>
     </w:p>
-    <w:bookmarkEnd w:id="132"/>
-    <w:bookmarkStart w:id="133" w:name="nfr-sec-007-audit-trail"/>
+    <w:bookmarkEnd w:id="139"/>
+    <w:bookmarkStart w:id="140" w:name="nfr-sec-007-audit-trail"/>
     <w:p>
       <w:pPr>
         <w:pStyle w:val="Heading3"/>
@@ -12130,9 +12801,9 @@
         <w:t xml:space="preserve">: TINGGI</w:t>
       </w:r>
     </w:p>
-    <w:bookmarkEnd w:id="133"/>
-    <w:bookmarkEnd w:id="134"/>
-    <w:bookmarkStart w:id="139" w:name="usability-use"/>
+    <w:bookmarkEnd w:id="140"/>
+    <w:bookmarkEnd w:id="141"/>
+    <w:bookmarkStart w:id="146" w:name="usability-use"/>
     <w:p>
       <w:pPr>
         <w:pStyle w:val="Heading2"/>
@@ -12150,7 +12821,7 @@
         <w:t xml:space="preserve">4.4 Usability (USE)</w:t>
       </w:r>
     </w:p>
-    <w:bookmarkStart w:id="135" w:name="nfr-use-001-bahasa-antarmuka"/>
+    <w:bookmarkStart w:id="142" w:name="nfr-use-001-bahasa-antarmuka"/>
     <w:p>
       <w:pPr>
         <w:pStyle w:val="Heading3"/>
@@ -12222,8 +12893,8 @@
         <w:t xml:space="preserve">: TINGGI</w:t>
       </w:r>
     </w:p>
-    <w:bookmarkEnd w:id="135"/>
-    <w:bookmarkStart w:id="136" w:name="nfr-use-002-petunjuk-konteks"/>
+    <w:bookmarkEnd w:id="142"/>
+    <w:bookmarkStart w:id="143" w:name="nfr-use-002-petunjuk-konteks"/>
     <w:p>
       <w:pPr>
         <w:pStyle w:val="Heading3"/>
@@ -12295,8 +12966,8 @@
         <w:t xml:space="preserve">: TINGGI</w:t>
       </w:r>
     </w:p>
-    <w:bookmarkEnd w:id="136"/>
-    <w:bookmarkStart w:id="137" w:name="X55d66978c3a26a5a0ed9394745424d5fbd9e8a2"/>
+    <w:bookmarkEnd w:id="143"/>
+    <w:bookmarkStart w:id="144" w:name="X55d66978c3a26a5a0ed9394745424d5fbd9e8a2"/>
     <w:p>
       <w:pPr>
         <w:pStyle w:val="Heading3"/>
@@ -12384,8 +13055,8 @@
         <w:t xml:space="preserve">: TINGGI</w:t>
       </w:r>
     </w:p>
-    <w:bookmarkEnd w:id="137"/>
-    <w:bookmarkStart w:id="138" w:name="nfr-use-004-responsif"/>
+    <w:bookmarkEnd w:id="144"/>
+    <w:bookmarkStart w:id="145" w:name="nfr-use-004-responsif"/>
     <w:p>
       <w:pPr>
         <w:pStyle w:val="Heading3"/>
@@ -12457,9 +13128,9 @@
         <w:t xml:space="preserve">: SEDANG</w:t>
       </w:r>
     </w:p>
-    <w:bookmarkEnd w:id="138"/>
-    <w:bookmarkEnd w:id="139"/>
-    <w:bookmarkStart w:id="144" w:name="reliabilitas-rel"/>
+    <w:bookmarkEnd w:id="145"/>
+    <w:bookmarkEnd w:id="146"/>
+    <w:bookmarkStart w:id="151" w:name="reliabilitas-rel"/>
     <w:p>
       <w:pPr>
         <w:pStyle w:val="Heading2"/>
@@ -12477,7 +13148,7 @@
         <w:t xml:space="preserve">4.5 Reliabilitas (REL)</w:t>
       </w:r>
     </w:p>
-    <w:bookmarkStart w:id="140" w:name="nfr-rel-001-ketersediaan"/>
+    <w:bookmarkStart w:id="147" w:name="nfr-rel-001-ketersediaan"/>
     <w:p>
       <w:pPr>
         <w:pStyle w:val="Heading3"/>
@@ -12549,8 +13220,8 @@
         <w:t xml:space="preserve">: TINGGI</w:t>
       </w:r>
     </w:p>
-    <w:bookmarkEnd w:id="140"/>
-    <w:bookmarkStart w:id="141" w:name="nfr-rel-002-pemulihan-dari-galat"/>
+    <w:bookmarkEnd w:id="147"/>
+    <w:bookmarkStart w:id="148" w:name="nfr-rel-002-pemulihan-dari-galat"/>
     <w:p>
       <w:pPr>
         <w:pStyle w:val="Heading3"/>
@@ -12650,8 +13321,8 @@
         <w:t xml:space="preserve">: TINGGI</w:t>
       </w:r>
     </w:p>
-    <w:bookmarkEnd w:id="141"/>
-    <w:bookmarkStart w:id="142" w:name="X86f0830a10774c8cf5a6d06d65d40b97a07af22"/>
+    <w:bookmarkEnd w:id="148"/>
+    <w:bookmarkStart w:id="149" w:name="X86f0830a10774c8cf5a6d06d65d40b97a07af22"/>
     <w:p>
       <w:pPr>
         <w:pStyle w:val="Heading3"/>
@@ -12736,8 +13407,8 @@
         <w:t xml:space="preserve">: TINGGI</w:t>
       </w:r>
     </w:p>
-    <w:bookmarkEnd w:id="142"/>
-    <w:bookmarkStart w:id="143" w:name="nfr-rel-004-persistensi-data"/>
+    <w:bookmarkEnd w:id="149"/>
+    <w:bookmarkStart w:id="150" w:name="nfr-rel-004-persistensi-data"/>
     <w:p>
       <w:pPr>
         <w:pStyle w:val="Heading3"/>
@@ -12841,9 +13512,9 @@
         <w:t xml:space="preserve">: TINGGI</w:t>
       </w:r>
     </w:p>
-    <w:bookmarkEnd w:id="143"/>
-    <w:bookmarkEnd w:id="144"/>
-    <w:bookmarkStart w:id="147" w:name="kompatibilitas-comp"/>
+    <w:bookmarkEnd w:id="150"/>
+    <w:bookmarkEnd w:id="151"/>
+    <w:bookmarkStart w:id="154" w:name="kompatibilitas-comp"/>
     <w:p>
       <w:pPr>
         <w:pStyle w:val="Heading2"/>
@@ -12861,7 +13532,7 @@
         <w:t xml:space="preserve">4.6 Kompatibilitas (COMP)</w:t>
       </w:r>
     </w:p>
-    <w:bookmarkStart w:id="145" w:name="nfr-comp-001-browser-yang-didukung"/>
+    <w:bookmarkStart w:id="152" w:name="nfr-comp-001-browser-yang-didukung"/>
     <w:p>
       <w:pPr>
         <w:pStyle w:val="Heading3"/>
@@ -12933,8 +13604,8 @@
         <w:t xml:space="preserve">: TINGGI</w:t>
       </w:r>
     </w:p>
-    <w:bookmarkEnd w:id="145"/>
-    <w:bookmarkStart w:id="146" w:name="nfr-comp-002-integrasi-uii-shibboleth"/>
+    <w:bookmarkEnd w:id="152"/>
+    <w:bookmarkStart w:id="153" w:name="nfr-comp-002-integrasi-uii-shibboleth"/>
     <w:p>
       <w:pPr>
         <w:pStyle w:val="Heading3"/>
@@ -13075,9 +13746,9 @@
         <w:t xml:space="preserve">: TINGGI</w:t>
       </w:r>
     </w:p>
-    <w:bookmarkEnd w:id="146"/>
-    <w:bookmarkEnd w:id="147"/>
-    <w:bookmarkStart w:id="152" w:name="maintainability-main"/>
+    <w:bookmarkEnd w:id="153"/>
+    <w:bookmarkEnd w:id="154"/>
+    <w:bookmarkStart w:id="159" w:name="maintainability-main"/>
     <w:p>
       <w:pPr>
         <w:pStyle w:val="Heading2"/>
@@ -13095,7 +13766,7 @@
         <w:t xml:space="preserve">4.7 Maintainability (MAIN)</w:t>
       </w:r>
     </w:p>
-    <w:bookmarkStart w:id="148" w:name="nfr-main-001-pemisahan-sumber-kebenaran"/>
+    <w:bookmarkStart w:id="155" w:name="nfr-main-001-pemisahan-sumber-kebenaran"/>
     <w:p>
       <w:pPr>
         <w:pStyle w:val="Heading3"/>
@@ -13167,8 +13838,8 @@
         <w:t xml:space="preserve">: TINGGI</w:t>
       </w:r>
     </w:p>
-    <w:bookmarkEnd w:id="148"/>
-    <w:bookmarkStart w:id="149" w:name="nfr-main-002-konfigurasi-via-environment"/>
+    <w:bookmarkEnd w:id="155"/>
+    <w:bookmarkStart w:id="156" w:name="nfr-main-002-konfigurasi-via-environment"/>
     <w:p>
       <w:pPr>
         <w:pStyle w:val="Heading3"/>
@@ -13273,8 +13944,8 @@
         <w:t xml:space="preserve">: TINGGI</w:t>
       </w:r>
     </w:p>
-    <w:bookmarkEnd w:id="149"/>
-    <w:bookmarkStart w:id="150" w:name="nfr-main-003-dokumentasi-teknis"/>
+    <w:bookmarkEnd w:id="156"/>
+    <w:bookmarkStart w:id="157" w:name="nfr-main-003-dokumentasi-teknis"/>
     <w:p>
       <w:pPr>
         <w:pStyle w:val="Heading3"/>
@@ -13346,8 +14017,8 @@
         <w:t xml:space="preserve">: TINGGI</w:t>
       </w:r>
     </w:p>
-    <w:bookmarkEnd w:id="150"/>
-    <w:bookmarkStart w:id="151" w:name="nfr-main-004-logging-operasional"/>
+    <w:bookmarkEnd w:id="157"/>
+    <w:bookmarkStart w:id="158" w:name="nfr-main-004-logging-operasional"/>
     <w:p>
       <w:pPr>
         <w:pStyle w:val="Heading3"/>
@@ -13450,9 +14121,9 @@
         <w:t xml:space="preserve">: TINGGI</w:t>
       </w:r>
     </w:p>
-    <w:bookmarkEnd w:id="151"/>
-    <w:bookmarkEnd w:id="152"/>
-    <w:bookmarkStart w:id="156" w:name="legal-kepatuhan-legal"/>
+    <w:bookmarkEnd w:id="158"/>
+    <w:bookmarkEnd w:id="159"/>
+    <w:bookmarkStart w:id="163" w:name="legal-kepatuhan-legal"/>
     <w:p>
       <w:pPr>
         <w:pStyle w:val="Heading2"/>
@@ -13470,7 +14141,7 @@
         <w:t xml:space="preserve">4.8 Legal &amp; Kepatuhan (LEGAL)</w:t>
       </w:r>
     </w:p>
-    <w:bookmarkStart w:id="153" w:name="nfr-legal-001-penggunaan-identitas-uii"/>
+    <w:bookmarkStart w:id="160" w:name="nfr-legal-001-penggunaan-identitas-uii"/>
     <w:p>
       <w:pPr>
         <w:pStyle w:val="Heading3"/>
@@ -13558,8 +14229,8 @@
         <w:t xml:space="preserve">: TINGGI</w:t>
       </w:r>
     </w:p>
-    <w:bookmarkEnd w:id="153"/>
-    <w:bookmarkStart w:id="154" w:name="nfr-legal-002-perlindungan-data-pribadi"/>
+    <w:bookmarkEnd w:id="160"/>
+    <w:bookmarkStart w:id="161" w:name="nfr-legal-002-perlindungan-data-pribadi"/>
     <w:p>
       <w:pPr>
         <w:pStyle w:val="Heading3"/>
@@ -13647,8 +14318,8 @@
         <w:t xml:space="preserve">: TINGGI</w:t>
       </w:r>
     </w:p>
-    <w:bookmarkEnd w:id="154"/>
-    <w:bookmarkStart w:id="155" w:name="nfr-legal-003-keaslian-dokumen-resmi"/>
+    <w:bookmarkEnd w:id="161"/>
+    <w:bookmarkStart w:id="162" w:name="nfr-legal-003-keaslian-dokumen-resmi"/>
     <w:p>
       <w:pPr>
         <w:pStyle w:val="Heading3"/>
@@ -13730,10 +14401,10 @@
         <w:t xml:space="preserve">: TINGGI</w:t>
       </w:r>
     </w:p>
-    <w:bookmarkEnd w:id="155"/>
-    <w:bookmarkEnd w:id="156"/>
-    <w:bookmarkEnd w:id="157"/>
-    <w:bookmarkStart w:id="164" w:name="use-cases-per-peran"/>
+    <w:bookmarkEnd w:id="162"/>
+    <w:bookmarkEnd w:id="163"/>
+    <w:bookmarkEnd w:id="164"/>
+    <w:bookmarkStart w:id="171" w:name="use-cases-per-peran"/>
     <w:p>
       <w:pPr>
         <w:pStyle w:val="Heading1"/>
@@ -13751,7 +14422,7 @@
         <w:t xml:space="preserve">5. Use Cases per Peran</w:t>
       </w:r>
     </w:p>
-    <w:bookmarkStart w:id="158" w:name="mahasiswa"/>
+    <w:bookmarkStart w:id="165" w:name="mahasiswa"/>
     <w:p>
       <w:pPr>
         <w:pStyle w:val="Heading2"/>
@@ -14251,8 +14922,8 @@
         </w:tc>
       </w:tr>
     </w:tbl>
-    <w:bookmarkEnd w:id="158"/>
-    <w:bookmarkStart w:id="159" w:name="dosen"/>
+    <w:bookmarkEnd w:id="165"/>
+    <w:bookmarkStart w:id="166" w:name="dosen"/>
     <w:p>
       <w:pPr>
         <w:pStyle w:val="Heading2"/>
@@ -14524,8 +15195,8 @@
         </w:tc>
       </w:tr>
     </w:tbl>
-    <w:bookmarkEnd w:id="159"/>
-    <w:bookmarkStart w:id="160" w:name="tendik-staff"/>
+    <w:bookmarkEnd w:id="166"/>
+    <w:bookmarkStart w:id="167" w:name="tendik-staff"/>
     <w:p>
       <w:pPr>
         <w:pStyle w:val="Heading2"/>
@@ -14797,8 +15468,8 @@
         </w:tc>
       </w:tr>
     </w:tbl>
-    <w:bookmarkEnd w:id="160"/>
-    <w:bookmarkStart w:id="161" w:name="laboran"/>
+    <w:bookmarkEnd w:id="167"/>
+    <w:bookmarkStart w:id="168" w:name="laboran"/>
     <w:p>
       <w:pPr>
         <w:pStyle w:val="Heading2"/>
@@ -15304,8 +15975,8 @@
         </w:tc>
       </w:tr>
     </w:tbl>
-    <w:bookmarkEnd w:id="161"/>
-    <w:bookmarkStart w:id="162" w:name="kepala-lab"/>
+    <w:bookmarkEnd w:id="168"/>
+    <w:bookmarkStart w:id="169" w:name="kepala-lab"/>
     <w:p>
       <w:pPr>
         <w:pStyle w:val="Heading2"/>
@@ -15567,8 +16238,8 @@
         </w:tc>
       </w:tr>
     </w:tbl>
-    <w:bookmarkEnd w:id="162"/>
-    <w:bookmarkStart w:id="163" w:name="super-admin"/>
+    <w:bookmarkEnd w:id="169"/>
+    <w:bookmarkStart w:id="170" w:name="super-admin"/>
     <w:p>
       <w:pPr>
         <w:pStyle w:val="Heading2"/>
@@ -15830,9 +16501,9 @@
         </w:tc>
       </w:tr>
     </w:tbl>
-    <w:bookmarkEnd w:id="163"/>
-    <w:bookmarkEnd w:id="164"/>
-    <w:bookmarkStart w:id="169" w:name="constraints-asumsi"/>
+    <w:bookmarkEnd w:id="170"/>
+    <w:bookmarkEnd w:id="171"/>
+    <w:bookmarkStart w:id="176" w:name="constraints-asumsi"/>
     <w:p>
       <w:pPr>
         <w:pStyle w:val="Heading1"/>
@@ -15850,7 +16521,7 @@
         <w:t xml:space="preserve">6. Constraints &amp; Asumsi</w:t>
       </w:r>
     </w:p>
-    <w:bookmarkStart w:id="165" w:name="constraints-bisnis"/>
+    <w:bookmarkStart w:id="172" w:name="constraints-bisnis"/>
     <w:p>
       <w:pPr>
         <w:pStyle w:val="Heading2"/>
@@ -16013,8 +16684,8 @@
         </w:tc>
       </w:tr>
     </w:tbl>
-    <w:bookmarkEnd w:id="165"/>
-    <w:bookmarkStart w:id="166" w:name="constraints-teknis"/>
+    <w:bookmarkEnd w:id="172"/>
+    <w:bookmarkStart w:id="173" w:name="constraints-teknis"/>
     <w:p>
       <w:pPr>
         <w:pStyle w:val="Heading2"/>
@@ -16248,8 +16919,8 @@
         </w:tc>
       </w:tr>
     </w:tbl>
-    <w:bookmarkEnd w:id="166"/>
-    <w:bookmarkStart w:id="167" w:name="constraints-hukum-regulasi"/>
+    <w:bookmarkEnd w:id="173"/>
+    <w:bookmarkStart w:id="174" w:name="constraints-hukum-regulasi"/>
     <w:p>
       <w:pPr>
         <w:pStyle w:val="Heading2"/>
@@ -16386,8 +17057,8 @@
         </w:tc>
       </w:tr>
     </w:tbl>
-    <w:bookmarkEnd w:id="167"/>
-    <w:bookmarkStart w:id="168" w:name="asumsi-operasional"/>
+    <w:bookmarkEnd w:id="174"/>
+    <w:bookmarkStart w:id="175" w:name="asumsi-operasional"/>
     <w:p>
       <w:pPr>
         <w:pStyle w:val="Heading2"/>
@@ -16589,9 +17260,9 @@
         </w:tc>
       </w:tr>
     </w:tbl>
-    <w:bookmarkEnd w:id="168"/>
-    <w:bookmarkEnd w:id="169"/>
-    <w:bookmarkStart w:id="173" w:name="acceptance-criteria-pengesahan"/>
+    <w:bookmarkEnd w:id="175"/>
+    <w:bookmarkEnd w:id="176"/>
+    <w:bookmarkStart w:id="180" w:name="acceptance-criteria-pengesahan"/>
     <w:p>
       <w:pPr>
         <w:pStyle w:val="Heading1"/>
@@ -16609,7 +17280,7 @@
         <w:t xml:space="preserve">7. Acceptance Criteria &amp; Pengesahan</w:t>
       </w:r>
     </w:p>
-    <w:bookmarkStart w:id="170" w:name="definisi-done-acceptance"/>
+    <w:bookmarkStart w:id="177" w:name="definisi-done-acceptance"/>
     <w:p>
       <w:pPr>
         <w:pStyle w:val="Heading2"/>
@@ -16965,8 +17636,8 @@
         <w:t xml:space="preserve">dengan otorisasi yang sesuai.</w:t>
       </w:r>
     </w:p>
-    <w:bookmarkEnd w:id="170"/>
-    <w:bookmarkStart w:id="171" w:name="pengujian-penerimaan-cuplikan"/>
+    <w:bookmarkEnd w:id="177"/>
+    <w:bookmarkStart w:id="178" w:name="pengujian-penerimaan-cuplikan"/>
     <w:p>
       <w:pPr>
         <w:pStyle w:val="Heading2"/>
@@ -17633,8 +18304,8 @@
         </w:tc>
       </w:tr>
     </w:tbl>
-    <w:bookmarkEnd w:id="171"/>
-    <w:bookmarkStart w:id="172" w:name="lembar-pengesahan"/>
+    <w:bookmarkEnd w:id="178"/>
+    <w:bookmarkStart w:id="179" w:name="lembar-pengesahan"/>
     <w:p>
       <w:pPr>
         <w:pStyle w:val="Heading2"/>
@@ -17890,9 +18561,9 @@
         <w:t xml:space="preserve">Yogyakarta, ____ April 2026</w:t>
       </w:r>
     </w:p>
-    <w:bookmarkEnd w:id="172"/>
-    <w:bookmarkEnd w:id="173"/>
-    <w:bookmarkStart w:id="174" w:name="lampiran-a-matriks-telusur-fr-use-case"/>
+    <w:bookmarkEnd w:id="179"/>
+    <w:bookmarkEnd w:id="180"/>
+    <w:bookmarkStart w:id="181" w:name="lampiran-a-matriks-telusur-fr-use-case"/>
     <w:p>
       <w:pPr>
         <w:pStyle w:val="Heading1"/>
@@ -18601,8 +19272,8 @@
         </w:tc>
       </w:tr>
     </w:tbl>
-    <w:bookmarkEnd w:id="174"/>
-    <w:bookmarkStart w:id="175" w:name="lampiran-b-daftar-singkat-persyaratan"/>
+    <w:bookmarkEnd w:id="181"/>
+    <w:bookmarkStart w:id="182" w:name="lampiran-b-daftar-singkat-persyaratan"/>
     <w:p>
       <w:pPr>
         <w:pStyle w:val="Heading1"/>
@@ -18669,7 +19340,7 @@
         <w:t xml:space="preserve">Dokumen ini bersifat normatif untuk penerimaan sistem. Setelah ditandatangani, perubahan signifikan pada persyaratan harus melalui proses revisi formal dan pengesahan ulang.</w:t>
       </w:r>
     </w:p>
-    <w:bookmarkEnd w:id="175"/>
+    <w:bookmarkEnd w:id="182"/>
     <w:sectPr/>
   </w:body>
 </w:document>

</xml_diff>